<commit_message>
docs: agregar documentacion completa patrones Singleton, Observer y Factory Method
</commit_message>
<xml_diff>
--- a/Actividad_1/diseño/Patrones_Diseño.docx
+++ b/Actividad_1/diseño/Patrones_Diseño.docx
@@ -3417,7 +3417,6 @@
           </w:tcPr>
           <w:p>
             <w:pPr>
-              <w:spacing w:after="160"/>
               <w:jc w:val="center"/>
               <w:rPr>
                 <w:rFonts w:ascii="Arial" w:hAnsi="Arial" w:cs="Arial"/>
@@ -3445,7 +3444,6 @@
           </w:tcPr>
           <w:p>
             <w:pPr>
-              <w:spacing w:after="160"/>
               <w:jc w:val="center"/>
               <w:rPr>
                 <w:rFonts w:ascii="Arial" w:hAnsi="Arial" w:cs="Arial"/>
@@ -3473,7 +3471,6 @@
           </w:tcPr>
           <w:p>
             <w:pPr>
-              <w:spacing w:after="160"/>
               <w:jc w:val="center"/>
               <w:rPr>
                 <w:rFonts w:ascii="Arial" w:hAnsi="Arial" w:cs="Arial"/>
@@ -3501,7 +3498,6 @@
           </w:tcPr>
           <w:p>
             <w:pPr>
-              <w:spacing w:after="160"/>
               <w:jc w:val="center"/>
               <w:rPr>
                 <w:rFonts w:ascii="Arial" w:hAnsi="Arial" w:cs="Arial"/>
@@ -3523,6 +3519,9 @@
         </w:tc>
       </w:tr>
       <w:tr>
+        <w:trPr>
+          <w:trHeight w:val="637"/>
+        </w:trPr>
         <w:tc>
           <w:tcPr>
             <w:tcW w:w="1129" w:type="dxa"/>
@@ -3531,7 +3530,6 @@
           </w:tcPr>
           <w:p>
             <w:pPr>
-              <w:spacing w:after="160"/>
               <w:jc w:val="center"/>
               <w:rPr>
                 <w:rFonts w:ascii="Arial" w:hAnsi="Arial" w:cs="Arial"/>
@@ -3555,7 +3553,6 @@
           </w:tcPr>
           <w:p>
             <w:pPr>
-              <w:spacing w:after="160"/>
               <w:jc w:val="center"/>
               <w:rPr>
                 <w:rFonts w:ascii="Arial" w:hAnsi="Arial" w:cs="Arial"/>
@@ -3578,7 +3575,6 @@
           </w:tcPr>
           <w:p>
             <w:pPr>
-              <w:spacing w:after="160"/>
               <w:rPr>
                 <w:rFonts w:ascii="Arial" w:hAnsi="Arial" w:cs="Arial"/>
                 <w:lang w:val="es-ES" w:eastAsia="es-EC"/>
@@ -3617,7 +3613,6 @@
           </w:tcPr>
           <w:p>
             <w:pPr>
-              <w:spacing w:after="160"/>
               <w:jc w:val="center"/>
               <w:rPr>
                 <w:rFonts w:ascii="Arial" w:hAnsi="Arial" w:cs="Arial"/>
@@ -3635,6 +3630,9 @@
         </w:tc>
       </w:tr>
       <w:tr>
+        <w:trPr>
+          <w:trHeight w:val="831"/>
+        </w:trPr>
         <w:tc>
           <w:tcPr>
             <w:tcW w:w="1129" w:type="dxa"/>
@@ -3643,7 +3641,6 @@
           </w:tcPr>
           <w:p>
             <w:pPr>
-              <w:spacing w:after="160"/>
               <w:jc w:val="center"/>
               <w:rPr>
                 <w:rFonts w:ascii="Arial" w:hAnsi="Arial" w:cs="Arial"/>
@@ -3667,7 +3664,6 @@
           </w:tcPr>
           <w:p>
             <w:pPr>
-              <w:spacing w:after="160"/>
               <w:jc w:val="center"/>
               <w:rPr>
                 <w:rFonts w:ascii="Arial" w:hAnsi="Arial" w:cs="Arial"/>
@@ -3690,7 +3686,6 @@
           </w:tcPr>
           <w:p>
             <w:pPr>
-              <w:spacing w:after="160"/>
               <w:rPr>
                 <w:rFonts w:ascii="Arial" w:hAnsi="Arial" w:cs="Arial"/>
                 <w:lang w:val="es-ES" w:eastAsia="es-EC"/>
@@ -3713,7 +3708,6 @@
           </w:tcPr>
           <w:p>
             <w:pPr>
-              <w:spacing w:after="160"/>
               <w:jc w:val="center"/>
               <w:rPr>
                 <w:rFonts w:ascii="Arial" w:hAnsi="Arial" w:cs="Arial"/>
@@ -3731,6 +3725,9 @@
         </w:tc>
       </w:tr>
       <w:tr>
+        <w:trPr>
+          <w:trHeight w:val="559"/>
+        </w:trPr>
         <w:tc>
           <w:tcPr>
             <w:tcW w:w="1129" w:type="dxa"/>
@@ -3739,7 +3736,6 @@
           </w:tcPr>
           <w:p>
             <w:pPr>
-              <w:spacing w:after="160"/>
               <w:jc w:val="center"/>
               <w:rPr>
                 <w:rFonts w:ascii="Arial" w:hAnsi="Arial" w:cs="Arial"/>
@@ -3763,7 +3759,6 @@
           </w:tcPr>
           <w:p>
             <w:pPr>
-              <w:spacing w:after="160"/>
               <w:jc w:val="center"/>
               <w:rPr>
                 <w:rFonts w:ascii="Arial" w:hAnsi="Arial" w:cs="Arial"/>
@@ -3786,7 +3781,6 @@
           </w:tcPr>
           <w:p>
             <w:pPr>
-              <w:spacing w:after="160"/>
               <w:rPr>
                 <w:rFonts w:ascii="Arial" w:hAnsi="Arial" w:cs="Arial"/>
                 <w:lang w:val="es-ES" w:eastAsia="es-EC"/>
@@ -3825,7 +3819,6 @@
           </w:tcPr>
           <w:p>
             <w:pPr>
-              <w:spacing w:after="160"/>
               <w:jc w:val="center"/>
               <w:rPr>
                 <w:rFonts w:ascii="Arial" w:hAnsi="Arial" w:cs="Arial"/>
@@ -3851,7 +3844,6 @@
           </w:tcPr>
           <w:p>
             <w:pPr>
-              <w:spacing w:after="160"/>
               <w:jc w:val="center"/>
               <w:rPr>
                 <w:rFonts w:ascii="Arial" w:hAnsi="Arial" w:cs="Arial"/>
@@ -3863,7 +3855,6 @@
                 <w:rFonts w:ascii="Arial" w:hAnsi="Arial" w:cs="Arial"/>
                 <w:lang w:val="es-ES" w:eastAsia="es-EC"/>
               </w:rPr>
-              <w:lastRenderedPageBreak/>
               <w:t>RNF-04</w:t>
             </w:r>
           </w:p>
@@ -3876,7 +3867,6 @@
           </w:tcPr>
           <w:p>
             <w:pPr>
-              <w:spacing w:after="160"/>
               <w:jc w:val="center"/>
               <w:rPr>
                 <w:rFonts w:ascii="Arial" w:hAnsi="Arial" w:cs="Arial"/>
@@ -3899,7 +3889,6 @@
           </w:tcPr>
           <w:p>
             <w:pPr>
-              <w:spacing w:after="160"/>
               <w:rPr>
                 <w:rFonts w:ascii="Arial" w:hAnsi="Arial" w:cs="Arial"/>
                 <w:lang w:val="es-ES" w:eastAsia="es-EC"/>
@@ -3922,7 +3911,6 @@
           </w:tcPr>
           <w:p>
             <w:pPr>
-              <w:spacing w:after="160"/>
               <w:jc w:val="center"/>
               <w:rPr>
                 <w:rFonts w:ascii="Arial" w:hAnsi="Arial" w:cs="Arial"/>
@@ -3940,6 +3928,9 @@
         </w:tc>
       </w:tr>
       <w:tr>
+        <w:trPr>
+          <w:trHeight w:val="668"/>
+        </w:trPr>
         <w:tc>
           <w:tcPr>
             <w:tcW w:w="1129" w:type="dxa"/>
@@ -3948,7 +3939,6 @@
           </w:tcPr>
           <w:p>
             <w:pPr>
-              <w:spacing w:after="160"/>
               <w:jc w:val="center"/>
               <w:rPr>
                 <w:rFonts w:ascii="Arial" w:hAnsi="Arial" w:cs="Arial"/>
@@ -3960,6 +3950,7 @@
                 <w:rFonts w:ascii="Arial" w:hAnsi="Arial" w:cs="Arial"/>
                 <w:lang w:val="es-ES" w:eastAsia="es-EC"/>
               </w:rPr>
+              <w:lastRenderedPageBreak/>
               <w:t>RNF-05</w:t>
             </w:r>
           </w:p>
@@ -3972,7 +3963,6 @@
           </w:tcPr>
           <w:p>
             <w:pPr>
-              <w:spacing w:after="160"/>
               <w:jc w:val="center"/>
               <w:rPr>
                 <w:rFonts w:ascii="Arial" w:hAnsi="Arial" w:cs="Arial"/>
@@ -3995,7 +3985,6 @@
           </w:tcPr>
           <w:p>
             <w:pPr>
-              <w:spacing w:after="160"/>
               <w:rPr>
                 <w:rFonts w:ascii="Arial" w:hAnsi="Arial" w:cs="Arial"/>
                 <w:lang w:val="es-ES" w:eastAsia="es-EC"/>
@@ -4018,7 +4007,6 @@
           </w:tcPr>
           <w:p>
             <w:pPr>
-              <w:spacing w:after="160"/>
               <w:jc w:val="center"/>
               <w:rPr>
                 <w:rFonts w:ascii="Arial" w:hAnsi="Arial" w:cs="Arial"/>
@@ -4036,6 +4024,9 @@
         </w:tc>
       </w:tr>
       <w:tr>
+        <w:trPr>
+          <w:trHeight w:val="422"/>
+        </w:trPr>
         <w:tc>
           <w:tcPr>
             <w:tcW w:w="1129" w:type="dxa"/>
@@ -4044,7 +4035,6 @@
           </w:tcPr>
           <w:p>
             <w:pPr>
-              <w:spacing w:after="160"/>
               <w:jc w:val="center"/>
               <w:rPr>
                 <w:rFonts w:ascii="Arial" w:hAnsi="Arial" w:cs="Arial"/>
@@ -4068,7 +4058,6 @@
           </w:tcPr>
           <w:p>
             <w:pPr>
-              <w:spacing w:after="160"/>
               <w:jc w:val="center"/>
               <w:rPr>
                 <w:rFonts w:ascii="Arial" w:hAnsi="Arial" w:cs="Arial"/>
@@ -4091,7 +4080,6 @@
           </w:tcPr>
           <w:p>
             <w:pPr>
-              <w:spacing w:after="160"/>
               <w:rPr>
                 <w:rFonts w:ascii="Arial" w:hAnsi="Arial" w:cs="Arial"/>
                 <w:lang w:val="es-ES" w:eastAsia="es-EC"/>
@@ -4114,7 +4102,6 @@
           </w:tcPr>
           <w:p>
             <w:pPr>
-              <w:spacing w:after="160"/>
               <w:jc w:val="center"/>
               <w:rPr>
                 <w:rFonts w:ascii="Arial" w:hAnsi="Arial" w:cs="Arial"/>
@@ -4132,6 +4119,9 @@
         </w:tc>
       </w:tr>
       <w:tr>
+        <w:trPr>
+          <w:trHeight w:val="556"/>
+        </w:trPr>
         <w:tc>
           <w:tcPr>
             <w:tcW w:w="1129" w:type="dxa"/>
@@ -4140,7 +4130,6 @@
           </w:tcPr>
           <w:p>
             <w:pPr>
-              <w:spacing w:after="160"/>
               <w:jc w:val="center"/>
               <w:rPr>
                 <w:rFonts w:ascii="Arial" w:hAnsi="Arial" w:cs="Arial"/>
@@ -4164,7 +4153,6 @@
           </w:tcPr>
           <w:p>
             <w:pPr>
-              <w:spacing w:after="160"/>
               <w:jc w:val="center"/>
               <w:rPr>
                 <w:rFonts w:ascii="Arial" w:hAnsi="Arial" w:cs="Arial"/>
@@ -4187,7 +4175,6 @@
           </w:tcPr>
           <w:p>
             <w:pPr>
-              <w:spacing w:after="160"/>
               <w:rPr>
                 <w:rFonts w:ascii="Arial" w:hAnsi="Arial" w:cs="Arial"/>
                 <w:lang w:val="es-ES" w:eastAsia="es-EC"/>
@@ -4210,7 +4197,6 @@
           </w:tcPr>
           <w:p>
             <w:pPr>
-              <w:spacing w:after="160"/>
               <w:jc w:val="center"/>
               <w:rPr>
                 <w:rFonts w:ascii="Arial" w:hAnsi="Arial" w:cs="Arial"/>
@@ -4228,6 +4214,9 @@
         </w:tc>
       </w:tr>
       <w:tr>
+        <w:trPr>
+          <w:trHeight w:val="691"/>
+        </w:trPr>
         <w:tc>
           <w:tcPr>
             <w:tcW w:w="1129" w:type="dxa"/>
@@ -4236,7 +4225,6 @@
           </w:tcPr>
           <w:p>
             <w:pPr>
-              <w:spacing w:after="160"/>
               <w:jc w:val="center"/>
               <w:rPr>
                 <w:rFonts w:ascii="Arial" w:hAnsi="Arial" w:cs="Arial"/>
@@ -4260,7 +4248,6 @@
           </w:tcPr>
           <w:p>
             <w:pPr>
-              <w:spacing w:after="160"/>
               <w:jc w:val="center"/>
               <w:rPr>
                 <w:rFonts w:ascii="Arial" w:hAnsi="Arial" w:cs="Arial"/>
@@ -4283,7 +4270,6 @@
           </w:tcPr>
           <w:p>
             <w:pPr>
-              <w:spacing w:after="160"/>
               <w:rPr>
                 <w:rFonts w:ascii="Arial" w:hAnsi="Arial" w:cs="Arial"/>
                 <w:lang w:val="es-ES" w:eastAsia="es-EC"/>
@@ -4306,7 +4292,6 @@
           </w:tcPr>
           <w:p>
             <w:pPr>
-              <w:spacing w:after="160"/>
               <w:jc w:val="center"/>
               <w:rPr>
                 <w:rFonts w:ascii="Arial" w:hAnsi="Arial" w:cs="Arial"/>
@@ -4324,6 +4309,9 @@
         </w:tc>
       </w:tr>
       <w:tr>
+        <w:trPr>
+          <w:trHeight w:val="559"/>
+        </w:trPr>
         <w:tc>
           <w:tcPr>
             <w:tcW w:w="1129" w:type="dxa"/>
@@ -4332,7 +4320,6 @@
           </w:tcPr>
           <w:p>
             <w:pPr>
-              <w:spacing w:after="160"/>
               <w:jc w:val="center"/>
               <w:rPr>
                 <w:rFonts w:ascii="Arial" w:hAnsi="Arial" w:cs="Arial"/>
@@ -4356,7 +4343,6 @@
           </w:tcPr>
           <w:p>
             <w:pPr>
-              <w:spacing w:after="160"/>
               <w:jc w:val="center"/>
               <w:rPr>
                 <w:rFonts w:ascii="Arial" w:hAnsi="Arial" w:cs="Arial"/>
@@ -4379,7 +4365,6 @@
           </w:tcPr>
           <w:p>
             <w:pPr>
-              <w:spacing w:after="160"/>
               <w:rPr>
                 <w:rFonts w:ascii="Arial" w:hAnsi="Arial" w:cs="Arial"/>
                 <w:lang w:val="es-ES" w:eastAsia="es-EC"/>
@@ -4402,7 +4387,6 @@
           </w:tcPr>
           <w:p>
             <w:pPr>
-              <w:spacing w:after="160"/>
               <w:jc w:val="center"/>
               <w:rPr>
                 <w:rFonts w:ascii="Arial" w:hAnsi="Arial" w:cs="Arial"/>
@@ -4420,6 +4404,9 @@
         </w:tc>
       </w:tr>
       <w:tr>
+        <w:trPr>
+          <w:trHeight w:val="709"/>
+        </w:trPr>
         <w:tc>
           <w:tcPr>
             <w:tcW w:w="1129" w:type="dxa"/>
@@ -4428,7 +4415,6 @@
           </w:tcPr>
           <w:p>
             <w:pPr>
-              <w:spacing w:after="160"/>
               <w:jc w:val="center"/>
               <w:rPr>
                 <w:rFonts w:ascii="Arial" w:hAnsi="Arial" w:cs="Arial"/>
@@ -4452,7 +4438,6 @@
           </w:tcPr>
           <w:p>
             <w:pPr>
-              <w:spacing w:after="160"/>
               <w:jc w:val="center"/>
               <w:rPr>
                 <w:rFonts w:ascii="Arial" w:hAnsi="Arial" w:cs="Arial"/>
@@ -4475,7 +4460,6 @@
           </w:tcPr>
           <w:p>
             <w:pPr>
-              <w:spacing w:after="160"/>
               <w:rPr>
                 <w:rFonts w:ascii="Arial" w:hAnsi="Arial" w:cs="Arial"/>
                 <w:lang w:val="es-ES" w:eastAsia="es-EC"/>
@@ -4498,7 +4482,6 @@
           </w:tcPr>
           <w:p>
             <w:pPr>
-              <w:spacing w:after="160"/>
               <w:jc w:val="center"/>
               <w:rPr>
                 <w:rFonts w:ascii="Arial" w:hAnsi="Arial" w:cs="Arial"/>
@@ -4525,21 +4508,9 @@
           <w:lang w:eastAsia="es-EC"/>
         </w:rPr>
       </w:pPr>
-      <w:r>
-        <w:rPr>
-          <w:rFonts w:ascii="Arial" w:hAnsi="Arial" w:cs="Arial"/>
-          <w:b/>
-          <w:bCs/>
-          <w:lang w:eastAsia="es-EC"/>
-        </w:rPr>
-        <w:br w:type="page"/>
-      </w:r>
     </w:p>
     <w:p>
       <w:pPr>
-        <w:pStyle w:val="Sinespaciado"/>
-        <w:spacing w:line="360" w:lineRule="auto"/>
-        <w:jc w:val="both"/>
         <w:rPr>
           <w:rFonts w:ascii="Arial" w:hAnsi="Arial" w:cs="Arial"/>
           <w:b/>
@@ -4554,8 +4525,26 @@
           <w:bCs/>
           <w:lang w:eastAsia="es-EC"/>
         </w:rPr>
-        <w:lastRenderedPageBreak/>
-        <w:t>Evidencias</w:t>
+        <w:t>Diseño del sistema</w:t>
+      </w:r>
+    </w:p>
+    <w:p>
+      <w:pPr>
+        <w:rPr>
+          <w:rFonts w:ascii="Arial" w:hAnsi="Arial" w:cs="Arial"/>
+          <w:b/>
+          <w:bCs/>
+          <w:lang w:eastAsia="es-EC"/>
+        </w:rPr>
+      </w:pPr>
+      <w:r>
+        <w:rPr>
+          <w:rFonts w:ascii="Arial" w:hAnsi="Arial" w:cs="Arial"/>
+          <w:b/>
+          <w:bCs/>
+          <w:lang w:eastAsia="es-EC"/>
+        </w:rPr>
+        <w:t>Repositorio</w:t>
       </w:r>
     </w:p>
     <w:p>
@@ -4581,19 +4570,6 @@
       </w:pPr>
       <w:r>
         <w:rPr>
-          <w:rFonts w:ascii="Arial" w:hAnsi="Arial" w:cs="Arial"/>
-          <w:b/>
-          <w:bCs/>
-          <w:i/>
-          <w:iCs/>
-          <w:sz w:val="20"/>
-          <w:szCs w:val="20"/>
-          <w:lang w:eastAsia="es-EC"/>
-        </w:rPr>
-        <w:t>(</w:t>
-      </w:r>
-      <w:r>
-        <w:rPr>
           <w:rFonts w:ascii="Arial" w:eastAsia="Arial" w:hAnsi="Arial" w:cs="Arial"/>
           <w:i/>
           <w:iCs/>
@@ -4601,7 +4577,1907 @@
           <w:sz w:val="20"/>
           <w:szCs w:val="20"/>
         </w:rPr>
-        <w:t>Código de la ejecución de los ejercicios, enlace drive donde se encuentren los mismos y Capturas de pantalla claras y relevantes, donde evidencie el proceso realizado).</w:t>
+        <w:drawing>
+          <wp:inline distT="0" distB="0" distL="0" distR="0" wp14:anchorId="2EEDD74C" wp14:editId="75694AA9">
+            <wp:extent cx="5400040" cy="3501390"/>
+            <wp:effectExtent l="0" t="0" r="0" b="3810"/>
+            <wp:docPr id="1763323563" name="Imagen 1"/>
+            <wp:cNvGraphicFramePr>
+              <a:graphicFrameLocks xmlns:a="http://schemas.openxmlformats.org/drawingml/2006/main" noChangeAspect="1"/>
+            </wp:cNvGraphicFramePr>
+            <a:graphic xmlns:a="http://schemas.openxmlformats.org/drawingml/2006/main">
+              <a:graphicData uri="http://schemas.openxmlformats.org/drawingml/2006/picture">
+                <pic:pic xmlns:pic="http://schemas.openxmlformats.org/drawingml/2006/picture">
+                  <pic:nvPicPr>
+                    <pic:cNvPr id="1763323563" name=""/>
+                    <pic:cNvPicPr/>
+                  </pic:nvPicPr>
+                  <pic:blipFill>
+                    <a:blip r:embed="rId14"/>
+                    <a:stretch>
+                      <a:fillRect/>
+                    </a:stretch>
+                  </pic:blipFill>
+                  <pic:spPr>
+                    <a:xfrm>
+                      <a:off x="0" y="0"/>
+                      <a:ext cx="5400040" cy="3501390"/>
+                    </a:xfrm>
+                    <a:prstGeom prst="rect">
+                      <a:avLst/>
+                    </a:prstGeom>
+                  </pic:spPr>
+                </pic:pic>
+              </a:graphicData>
+            </a:graphic>
+          </wp:inline>
+        </w:drawing>
+      </w:r>
+    </w:p>
+    <w:p>
+      <w:pPr>
+        <w:widowControl w:val="0"/>
+        <w:pBdr>
+          <w:top w:val="nil"/>
+          <w:left w:val="nil"/>
+          <w:bottom w:val="nil"/>
+          <w:right w:val="nil"/>
+          <w:between w:val="nil"/>
+        </w:pBdr>
+        <w:spacing w:after="0" w:line="240" w:lineRule="auto"/>
+        <w:jc w:val="center"/>
+        <w:rPr>
+          <w:rFonts w:ascii="Arial" w:eastAsia="Arial" w:hAnsi="Arial" w:cs="Arial"/>
+          <w:i/>
+          <w:iCs/>
+          <w:color w:val="000000"/>
+          <w:sz w:val="20"/>
+          <w:szCs w:val="20"/>
+        </w:rPr>
+      </w:pPr>
+      <w:r>
+        <w:rPr>
+          <w:rFonts w:ascii="Arial" w:eastAsia="Arial" w:hAnsi="Arial" w:cs="Arial"/>
+          <w:i/>
+          <w:iCs/>
+          <w:color w:val="000000"/>
+          <w:sz w:val="20"/>
+          <w:szCs w:val="20"/>
+        </w:rPr>
+        <w:t>Creación del repositorio en GitHub</w:t>
+      </w:r>
+    </w:p>
+    <w:p>
+      <w:pPr>
+        <w:rPr>
+          <w:rFonts w:ascii="Arial" w:hAnsi="Arial" w:cs="Arial"/>
+          <w:b/>
+          <w:bCs/>
+          <w:lang w:eastAsia="es-EC"/>
+        </w:rPr>
+      </w:pPr>
+    </w:p>
+    <w:p>
+      <w:pPr>
+        <w:rPr>
+          <w:rFonts w:ascii="Arial" w:hAnsi="Arial" w:cs="Arial"/>
+          <w:b/>
+          <w:bCs/>
+          <w:lang w:eastAsia="es-EC"/>
+        </w:rPr>
+      </w:pPr>
+    </w:p>
+    <w:p>
+      <w:pPr>
+        <w:rPr>
+          <w:rFonts w:ascii="Arial" w:hAnsi="Arial" w:cs="Arial"/>
+          <w:b/>
+          <w:bCs/>
+          <w:lang w:eastAsia="es-EC"/>
+        </w:rPr>
+      </w:pPr>
+    </w:p>
+    <w:p>
+      <w:pPr>
+        <w:rPr>
+          <w:rFonts w:ascii="Arial" w:hAnsi="Arial" w:cs="Arial"/>
+          <w:b/>
+          <w:bCs/>
+          <w:lang w:eastAsia="es-EC"/>
+        </w:rPr>
+      </w:pPr>
+    </w:p>
+    <w:p>
+      <w:pPr>
+        <w:rPr>
+          <w:rFonts w:ascii="Arial" w:hAnsi="Arial" w:cs="Arial"/>
+          <w:b/>
+          <w:bCs/>
+          <w:lang w:eastAsia="es-EC"/>
+        </w:rPr>
+      </w:pPr>
+    </w:p>
+    <w:p>
+      <w:pPr>
+        <w:rPr>
+          <w:rFonts w:ascii="Arial" w:hAnsi="Arial" w:cs="Arial"/>
+          <w:b/>
+          <w:bCs/>
+          <w:lang w:eastAsia="es-EC"/>
+        </w:rPr>
+      </w:pPr>
+    </w:p>
+    <w:p>
+      <w:pPr>
+        <w:rPr>
+          <w:rFonts w:ascii="Arial" w:hAnsi="Arial" w:cs="Arial"/>
+          <w:b/>
+          <w:bCs/>
+          <w:lang w:eastAsia="es-EC"/>
+        </w:rPr>
+      </w:pPr>
+    </w:p>
+    <w:p>
+      <w:pPr>
+        <w:rPr>
+          <w:rFonts w:ascii="Arial" w:hAnsi="Arial" w:cs="Arial"/>
+          <w:b/>
+          <w:bCs/>
+          <w:lang w:eastAsia="es-EC"/>
+        </w:rPr>
+      </w:pPr>
+      <w:proofErr w:type="spellStart"/>
+      <w:r>
+        <w:rPr>
+          <w:rFonts w:ascii="Arial" w:hAnsi="Arial" w:cs="Arial"/>
+          <w:b/>
+          <w:bCs/>
+          <w:lang w:eastAsia="es-EC"/>
+        </w:rPr>
+        <w:lastRenderedPageBreak/>
+        <w:t>Gitflow</w:t>
+      </w:r>
+      <w:proofErr w:type="spellEnd"/>
+    </w:p>
+    <w:p>
+      <w:pPr>
+        <w:rPr>
+          <w:rFonts w:ascii="Arial" w:hAnsi="Arial" w:cs="Arial"/>
+          <w:b/>
+          <w:bCs/>
+          <w:lang w:eastAsia="es-EC"/>
+        </w:rPr>
+      </w:pPr>
+      <w:r>
+        <w:rPr>
+          <w:rFonts w:ascii="Arial" w:hAnsi="Arial" w:cs="Arial"/>
+          <w:b/>
+          <w:bCs/>
+          <w:lang w:eastAsia="es-EC"/>
+        </w:rPr>
+        <w:drawing>
+          <wp:inline distT="0" distB="0" distL="0" distR="0" wp14:anchorId="19D7899B" wp14:editId="3048E0E8">
+            <wp:extent cx="5400040" cy="3707130"/>
+            <wp:effectExtent l="0" t="0" r="0" b="7620"/>
+            <wp:docPr id="1952396631" name="Imagen 1"/>
+            <wp:cNvGraphicFramePr>
+              <a:graphicFrameLocks xmlns:a="http://schemas.openxmlformats.org/drawingml/2006/main" noChangeAspect="1"/>
+            </wp:cNvGraphicFramePr>
+            <a:graphic xmlns:a="http://schemas.openxmlformats.org/drawingml/2006/main">
+              <a:graphicData uri="http://schemas.openxmlformats.org/drawingml/2006/picture">
+                <pic:pic xmlns:pic="http://schemas.openxmlformats.org/drawingml/2006/picture">
+                  <pic:nvPicPr>
+                    <pic:cNvPr id="1952396631" name=""/>
+                    <pic:cNvPicPr/>
+                  </pic:nvPicPr>
+                  <pic:blipFill>
+                    <a:blip r:embed="rId15"/>
+                    <a:stretch>
+                      <a:fillRect/>
+                    </a:stretch>
+                  </pic:blipFill>
+                  <pic:spPr>
+                    <a:xfrm>
+                      <a:off x="0" y="0"/>
+                      <a:ext cx="5400040" cy="3707130"/>
+                    </a:xfrm>
+                    <a:prstGeom prst="rect">
+                      <a:avLst/>
+                    </a:prstGeom>
+                  </pic:spPr>
+                </pic:pic>
+              </a:graphicData>
+            </a:graphic>
+          </wp:inline>
+        </w:drawing>
+      </w:r>
+    </w:p>
+    <w:p>
+      <w:pPr>
+        <w:jc w:val="center"/>
+        <w:rPr>
+          <w:rFonts w:ascii="Arial" w:hAnsi="Arial" w:cs="Arial"/>
+          <w:i/>
+          <w:iCs/>
+          <w:sz w:val="20"/>
+          <w:szCs w:val="20"/>
+          <w:lang w:eastAsia="es-EC"/>
+        </w:rPr>
+      </w:pPr>
+      <w:r>
+        <w:rPr>
+          <w:rFonts w:ascii="Arial" w:hAnsi="Arial" w:cs="Arial"/>
+          <w:i/>
+          <w:iCs/>
+          <w:sz w:val="20"/>
+          <w:szCs w:val="20"/>
+          <w:lang w:eastAsia="es-EC"/>
+        </w:rPr>
+        <w:t xml:space="preserve">creación de ramas </w:t>
+      </w:r>
+      <w:r>
+        <w:rPr>
+          <w:rFonts w:ascii="Arial" w:hAnsi="Arial" w:cs="Arial"/>
+          <w:i/>
+          <w:iCs/>
+          <w:sz w:val="20"/>
+          <w:szCs w:val="20"/>
+          <w:lang w:eastAsia="es-EC"/>
+        </w:rPr>
+        <w:t>(</w:t>
+      </w:r>
+      <w:proofErr w:type="gramStart"/>
+      <w:r>
+        <w:rPr>
+          <w:rFonts w:ascii="Arial" w:hAnsi="Arial" w:cs="Arial"/>
+          <w:i/>
+          <w:iCs/>
+          <w:sz w:val="20"/>
+          <w:szCs w:val="20"/>
+          <w:lang w:eastAsia="es-EC"/>
+        </w:rPr>
+        <w:t>master</w:t>
+      </w:r>
+      <w:proofErr w:type="gramEnd"/>
+      <w:r>
+        <w:rPr>
+          <w:rFonts w:ascii="Arial" w:hAnsi="Arial" w:cs="Arial"/>
+          <w:i/>
+          <w:iCs/>
+          <w:sz w:val="20"/>
+          <w:szCs w:val="20"/>
+          <w:lang w:eastAsia="es-EC"/>
+        </w:rPr>
+        <w:t xml:space="preserve">, </w:t>
+      </w:r>
+      <w:proofErr w:type="spellStart"/>
+      <w:r>
+        <w:rPr>
+          <w:rFonts w:ascii="Arial" w:hAnsi="Arial" w:cs="Arial"/>
+          <w:i/>
+          <w:iCs/>
+          <w:sz w:val="20"/>
+          <w:szCs w:val="20"/>
+          <w:lang w:eastAsia="es-EC"/>
+        </w:rPr>
+        <w:t>develop</w:t>
+      </w:r>
+      <w:proofErr w:type="spellEnd"/>
+      <w:r>
+        <w:rPr>
+          <w:rFonts w:ascii="Arial" w:hAnsi="Arial" w:cs="Arial"/>
+          <w:i/>
+          <w:iCs/>
+          <w:sz w:val="20"/>
+          <w:szCs w:val="20"/>
+          <w:lang w:eastAsia="es-EC"/>
+        </w:rPr>
+        <w:t xml:space="preserve"> y ramas </w:t>
+      </w:r>
+      <w:proofErr w:type="spellStart"/>
+      <w:r>
+        <w:rPr>
+          <w:rFonts w:ascii="Arial" w:hAnsi="Arial" w:cs="Arial"/>
+          <w:i/>
+          <w:iCs/>
+          <w:sz w:val="20"/>
+          <w:szCs w:val="20"/>
+          <w:lang w:eastAsia="es-EC"/>
+        </w:rPr>
+        <w:t>feature</w:t>
+      </w:r>
+      <w:proofErr w:type="spellEnd"/>
+      <w:r>
+        <w:rPr>
+          <w:rFonts w:ascii="Arial" w:hAnsi="Arial" w:cs="Arial"/>
+          <w:i/>
+          <w:iCs/>
+          <w:sz w:val="20"/>
+          <w:szCs w:val="20"/>
+          <w:lang w:eastAsia="es-EC"/>
+        </w:rPr>
+        <w:t>/ para avances).</w:t>
+      </w:r>
+    </w:p>
+    <w:p>
+      <w:pPr>
+        <w:rPr>
+          <w:rFonts w:ascii="Arial" w:hAnsi="Arial" w:cs="Arial"/>
+          <w:b/>
+          <w:bCs/>
+          <w:lang w:eastAsia="es-EC"/>
+        </w:rPr>
+      </w:pPr>
+      <w:r>
+        <w:rPr>
+          <w:rFonts w:ascii="Arial" w:hAnsi="Arial" w:cs="Arial"/>
+          <w:b/>
+          <w:bCs/>
+          <w:lang w:eastAsia="es-EC"/>
+        </w:rPr>
+        <w:t>D</w:t>
+      </w:r>
+      <w:r>
+        <w:rPr>
+          <w:rFonts w:ascii="Arial" w:hAnsi="Arial" w:cs="Arial"/>
+          <w:b/>
+          <w:bCs/>
+          <w:lang w:eastAsia="es-EC"/>
+        </w:rPr>
+        <w:t>iagrama de casos de uso</w:t>
+      </w:r>
+    </w:p>
+    <w:p>
+      <w:pPr>
+        <w:rPr>
+          <w:rFonts w:ascii="Arial" w:hAnsi="Arial" w:cs="Arial"/>
+          <w:b/>
+          <w:bCs/>
+          <w:lang w:eastAsia="es-EC"/>
+        </w:rPr>
+      </w:pPr>
+      <w:r>
+        <w:rPr>
+          <w:rFonts w:ascii="Arial" w:hAnsi="Arial" w:cs="Arial"/>
+          <w:b/>
+          <w:bCs/>
+          <w:noProof/>
+          <w:lang w:eastAsia="es-EC"/>
+        </w:rPr>
+        <w:drawing>
+          <wp:inline distT="0" distB="0" distL="0" distR="0" wp14:anchorId="5E980975" wp14:editId="24FABFDF">
+            <wp:extent cx="5400040" cy="3599815"/>
+            <wp:effectExtent l="0" t="0" r="0" b="635"/>
+            <wp:docPr id="1720769435" name="Imagen 2"/>
+            <wp:cNvGraphicFramePr>
+              <a:graphicFrameLocks xmlns:a="http://schemas.openxmlformats.org/drawingml/2006/main" noChangeAspect="1"/>
+            </wp:cNvGraphicFramePr>
+            <a:graphic xmlns:a="http://schemas.openxmlformats.org/drawingml/2006/main">
+              <a:graphicData uri="http://schemas.openxmlformats.org/drawingml/2006/picture">
+                <pic:pic xmlns:pic="http://schemas.openxmlformats.org/drawingml/2006/picture">
+                  <pic:nvPicPr>
+                    <pic:cNvPr id="1720769435" name="Imagen 1720769435"/>
+                    <pic:cNvPicPr/>
+                  </pic:nvPicPr>
+                  <pic:blipFill>
+                    <a:blip r:embed="rId16" cstate="print">
+                      <a:extLst>
+                        <a:ext uri="{28A0092B-C50C-407E-A947-70E740481C1C}">
+                          <a14:useLocalDpi xmlns:a14="http://schemas.microsoft.com/office/drawing/2010/main" val="0"/>
+                        </a:ext>
+                      </a:extLst>
+                    </a:blip>
+                    <a:stretch>
+                      <a:fillRect/>
+                    </a:stretch>
+                  </pic:blipFill>
+                  <pic:spPr>
+                    <a:xfrm>
+                      <a:off x="0" y="0"/>
+                      <a:ext cx="5400040" cy="3599815"/>
+                    </a:xfrm>
+                    <a:prstGeom prst="rect">
+                      <a:avLst/>
+                    </a:prstGeom>
+                  </pic:spPr>
+                </pic:pic>
+              </a:graphicData>
+            </a:graphic>
+          </wp:inline>
+        </w:drawing>
+      </w:r>
+    </w:p>
+    <w:p>
+      <w:pPr>
+        <w:rPr>
+          <w:rFonts w:ascii="Arial" w:hAnsi="Arial" w:cs="Arial"/>
+          <w:b/>
+          <w:bCs/>
+          <w:lang w:eastAsia="es-EC"/>
+        </w:rPr>
+      </w:pPr>
+    </w:p>
+    <w:p>
+      <w:pPr>
+        <w:rPr>
+          <w:rFonts w:ascii="Arial" w:hAnsi="Arial" w:cs="Arial"/>
+          <w:b/>
+          <w:bCs/>
+          <w:lang w:eastAsia="es-EC"/>
+        </w:rPr>
+      </w:pPr>
+      <w:r>
+        <w:rPr>
+          <w:rFonts w:ascii="Arial" w:hAnsi="Arial" w:cs="Arial"/>
+          <w:b/>
+          <w:bCs/>
+          <w:lang w:eastAsia="es-EC"/>
+        </w:rPr>
+        <w:lastRenderedPageBreak/>
+        <w:t>D</w:t>
+      </w:r>
+      <w:r>
+        <w:rPr>
+          <w:rFonts w:ascii="Arial" w:hAnsi="Arial" w:cs="Arial"/>
+          <w:b/>
+          <w:bCs/>
+          <w:lang w:eastAsia="es-EC"/>
+        </w:rPr>
+        <w:t>iagrama de clases UML</w:t>
+      </w:r>
+    </w:p>
+    <w:p>
+      <w:pPr>
+        <w:rPr>
+          <w:rFonts w:ascii="Arial" w:hAnsi="Arial" w:cs="Arial"/>
+          <w:b/>
+          <w:bCs/>
+          <w:lang w:eastAsia="es-EC"/>
+        </w:rPr>
+      </w:pPr>
+      <w:r>
+        <w:rPr>
+          <w:rFonts w:ascii="Arial" w:hAnsi="Arial" w:cs="Arial"/>
+          <w:b/>
+          <w:bCs/>
+          <w:noProof/>
+          <w:lang w:eastAsia="es-EC"/>
+        </w:rPr>
+        <w:drawing>
+          <wp:inline distT="0" distB="0" distL="0" distR="0" wp14:anchorId="775A094D" wp14:editId="6E88576F">
+            <wp:extent cx="5400040" cy="6536690"/>
+            <wp:effectExtent l="0" t="0" r="0" b="0"/>
+            <wp:docPr id="1210199071" name="Imagen 3"/>
+            <wp:cNvGraphicFramePr>
+              <a:graphicFrameLocks xmlns:a="http://schemas.openxmlformats.org/drawingml/2006/main" noChangeAspect="1"/>
+            </wp:cNvGraphicFramePr>
+            <a:graphic xmlns:a="http://schemas.openxmlformats.org/drawingml/2006/main">
+              <a:graphicData uri="http://schemas.openxmlformats.org/drawingml/2006/picture">
+                <pic:pic xmlns:pic="http://schemas.openxmlformats.org/drawingml/2006/picture">
+                  <pic:nvPicPr>
+                    <pic:cNvPr id="1210199071" name="Imagen 1210199071"/>
+                    <pic:cNvPicPr/>
+                  </pic:nvPicPr>
+                  <pic:blipFill>
+                    <a:blip r:embed="rId17">
+                      <a:extLst>
+                        <a:ext uri="{28A0092B-C50C-407E-A947-70E740481C1C}">
+                          <a14:useLocalDpi xmlns:a14="http://schemas.microsoft.com/office/drawing/2010/main" val="0"/>
+                        </a:ext>
+                      </a:extLst>
+                    </a:blip>
+                    <a:stretch>
+                      <a:fillRect/>
+                    </a:stretch>
+                  </pic:blipFill>
+                  <pic:spPr>
+                    <a:xfrm>
+                      <a:off x="0" y="0"/>
+                      <a:ext cx="5400040" cy="6536690"/>
+                    </a:xfrm>
+                    <a:prstGeom prst="rect">
+                      <a:avLst/>
+                    </a:prstGeom>
+                  </pic:spPr>
+                </pic:pic>
+              </a:graphicData>
+            </a:graphic>
+          </wp:inline>
+        </w:drawing>
+      </w:r>
+    </w:p>
+    <w:p>
+      <w:pPr>
+        <w:rPr>
+          <w:rFonts w:ascii="Arial" w:hAnsi="Arial" w:cs="Arial"/>
+          <w:b/>
+          <w:bCs/>
+          <w:lang w:eastAsia="es-EC"/>
+        </w:rPr>
+      </w:pPr>
+    </w:p>
+    <w:p>
+      <w:pPr>
+        <w:rPr>
+          <w:rFonts w:ascii="Arial" w:hAnsi="Arial" w:cs="Arial"/>
+          <w:b/>
+          <w:bCs/>
+          <w:lang w:eastAsia="es-EC"/>
+        </w:rPr>
+      </w:pPr>
+    </w:p>
+    <w:p>
+      <w:pPr>
+        <w:rPr>
+          <w:rFonts w:ascii="Arial" w:hAnsi="Arial" w:cs="Arial"/>
+          <w:b/>
+          <w:bCs/>
+          <w:lang w:eastAsia="es-EC"/>
+        </w:rPr>
+      </w:pPr>
+    </w:p>
+    <w:p>
+      <w:pPr>
+        <w:rPr>
+          <w:rFonts w:ascii="Arial" w:hAnsi="Arial" w:cs="Arial"/>
+          <w:b/>
+          <w:bCs/>
+          <w:lang w:eastAsia="es-EC"/>
+        </w:rPr>
+      </w:pPr>
+    </w:p>
+    <w:p>
+      <w:pPr>
+        <w:rPr>
+          <w:rFonts w:ascii="Arial" w:hAnsi="Arial" w:cs="Arial"/>
+          <w:b/>
+          <w:bCs/>
+          <w:lang w:eastAsia="es-EC"/>
+        </w:rPr>
+      </w:pPr>
+    </w:p>
+    <w:p>
+      <w:pPr>
+        <w:rPr>
+          <w:rFonts w:ascii="Arial" w:hAnsi="Arial" w:cs="Arial"/>
+          <w:b/>
+          <w:bCs/>
+          <w:lang w:eastAsia="es-EC"/>
+        </w:rPr>
+      </w:pPr>
+    </w:p>
+    <w:p>
+      <w:pPr>
+        <w:rPr>
+          <w:rFonts w:ascii="Arial" w:hAnsi="Arial" w:cs="Arial"/>
+          <w:b/>
+          <w:bCs/>
+          <w:lang w:eastAsia="es-EC"/>
+        </w:rPr>
+      </w:pPr>
+      <w:r>
+        <w:rPr>
+          <w:rFonts w:ascii="Arial" w:hAnsi="Arial" w:cs="Arial"/>
+          <w:b/>
+          <w:bCs/>
+          <w:lang w:eastAsia="es-EC"/>
+        </w:rPr>
+        <w:lastRenderedPageBreak/>
+        <w:t>A</w:t>
+      </w:r>
+      <w:r>
+        <w:rPr>
+          <w:rFonts w:ascii="Arial" w:hAnsi="Arial" w:cs="Arial"/>
+          <w:b/>
+          <w:bCs/>
+          <w:lang w:eastAsia="es-EC"/>
+        </w:rPr>
+        <w:t>rquitectura general del sistema</w:t>
+      </w:r>
+    </w:p>
+    <w:p>
+      <w:pPr>
+        <w:jc w:val="center"/>
+        <w:rPr>
+          <w:rFonts w:ascii="Arial" w:hAnsi="Arial" w:cs="Arial"/>
+          <w:b/>
+          <w:bCs/>
+          <w:lang w:eastAsia="es-EC"/>
+        </w:rPr>
+      </w:pPr>
+      <w:r>
+        <w:rPr>
+          <w:rFonts w:ascii="Arial" w:hAnsi="Arial" w:cs="Arial"/>
+          <w:b/>
+          <w:bCs/>
+          <w:noProof/>
+          <w:lang w:eastAsia="es-EC"/>
+        </w:rPr>
+        <w:drawing>
+          <wp:inline distT="0" distB="0" distL="0" distR="0" wp14:anchorId="05693A64" wp14:editId="5FA15F06">
+            <wp:extent cx="4876165" cy="1443813"/>
+            <wp:effectExtent l="0" t="0" r="635" b="4445"/>
+            <wp:docPr id="1381467995" name="Imagen 4"/>
+            <wp:cNvGraphicFramePr>
+              <a:graphicFrameLocks xmlns:a="http://schemas.openxmlformats.org/drawingml/2006/main" noChangeAspect="1"/>
+            </wp:cNvGraphicFramePr>
+            <a:graphic xmlns:a="http://schemas.openxmlformats.org/drawingml/2006/main">
+              <a:graphicData uri="http://schemas.openxmlformats.org/drawingml/2006/picture">
+                <pic:pic xmlns:pic="http://schemas.openxmlformats.org/drawingml/2006/picture">
+                  <pic:nvPicPr>
+                    <pic:cNvPr id="1381467995" name="Imagen 1381467995"/>
+                    <pic:cNvPicPr/>
+                  </pic:nvPicPr>
+                  <pic:blipFill>
+                    <a:blip r:embed="rId18">
+                      <a:extLst>
+                        <a:ext uri="{28A0092B-C50C-407E-A947-70E740481C1C}">
+                          <a14:useLocalDpi xmlns:a14="http://schemas.microsoft.com/office/drawing/2010/main" val="0"/>
+                        </a:ext>
+                      </a:extLst>
+                    </a:blip>
+                    <a:stretch>
+                      <a:fillRect/>
+                    </a:stretch>
+                  </pic:blipFill>
+                  <pic:spPr>
+                    <a:xfrm>
+                      <a:off x="0" y="0"/>
+                      <a:ext cx="4885030" cy="1446438"/>
+                    </a:xfrm>
+                    <a:prstGeom prst="rect">
+                      <a:avLst/>
+                    </a:prstGeom>
+                  </pic:spPr>
+                </pic:pic>
+              </a:graphicData>
+            </a:graphic>
+          </wp:inline>
+        </w:drawing>
+      </w:r>
+    </w:p>
+    <w:p>
+      <w:pPr>
+        <w:spacing w:line="360" w:lineRule="auto"/>
+        <w:rPr>
+          <w:rFonts w:ascii="Arial" w:hAnsi="Arial" w:cs="Arial"/>
+          <w:b/>
+          <w:bCs/>
+          <w:lang w:eastAsia="es-EC"/>
+        </w:rPr>
+      </w:pPr>
+      <w:r>
+        <w:rPr>
+          <w:rFonts w:ascii="Arial" w:hAnsi="Arial" w:cs="Arial"/>
+          <w:b/>
+          <w:bCs/>
+          <w:lang w:eastAsia="es-EC"/>
+        </w:rPr>
+        <w:t>Aplicación de patrones de diseño</w:t>
+      </w:r>
+    </w:p>
+    <w:p>
+      <w:pPr>
+        <w:spacing w:line="360" w:lineRule="auto"/>
+        <w:ind w:firstLine="708"/>
+        <w:jc w:val="both"/>
+        <w:rPr>
+          <w:rFonts w:ascii="Arial" w:hAnsi="Arial" w:cs="Arial"/>
+          <w:lang w:val="es-ES" w:eastAsia="es-EC"/>
+        </w:rPr>
+      </w:pPr>
+      <w:r>
+        <w:rPr>
+          <w:rFonts w:ascii="Arial" w:hAnsi="Arial" w:cs="Arial"/>
+          <w:lang w:val="es-ES" w:eastAsia="es-EC"/>
+        </w:rPr>
+        <w:t xml:space="preserve">Para lograr una arquitectura robusta, mantenible y escalable en el sistema de Help </w:t>
+      </w:r>
+      <w:proofErr w:type="spellStart"/>
+      <w:r>
+        <w:rPr>
+          <w:rFonts w:ascii="Arial" w:hAnsi="Arial" w:cs="Arial"/>
+          <w:lang w:val="es-ES" w:eastAsia="es-EC"/>
+        </w:rPr>
+        <w:t>Desk</w:t>
+      </w:r>
+      <w:proofErr w:type="spellEnd"/>
+      <w:r>
+        <w:rPr>
+          <w:rFonts w:ascii="Arial" w:hAnsi="Arial" w:cs="Arial"/>
+          <w:lang w:val="es-ES" w:eastAsia="es-EC"/>
+        </w:rPr>
+        <w:t xml:space="preserve"> orientado a la gestión de fallos en un Data Center, se han implementado los siguientes cuatro patrones de diseño:</w:t>
+      </w:r>
+    </w:p>
+    <w:p>
+      <w:pPr>
+        <w:pStyle w:val="Prrafodelista"/>
+        <w:numPr>
+          <w:ilvl w:val="0"/>
+          <w:numId w:val="22"/>
+        </w:numPr>
+        <w:spacing w:line="360" w:lineRule="auto"/>
+        <w:jc w:val="both"/>
+        <w:rPr>
+          <w:rFonts w:ascii="Arial" w:hAnsi="Arial" w:cs="Arial"/>
+          <w:b/>
+          <w:bCs/>
+          <w:lang w:val="es-ES" w:eastAsia="es-EC"/>
+        </w:rPr>
+      </w:pPr>
+      <w:r>
+        <w:rPr>
+          <w:rFonts w:ascii="Arial" w:hAnsi="Arial" w:cs="Arial"/>
+          <w:b/>
+          <w:bCs/>
+          <w:lang w:val="es-ES" w:eastAsia="es-EC"/>
+        </w:rPr>
+        <w:t>Singleton</w:t>
+      </w:r>
+    </w:p>
+    <w:p>
+      <w:pPr>
+        <w:spacing w:line="360" w:lineRule="auto"/>
+        <w:ind w:firstLine="708"/>
+        <w:jc w:val="both"/>
+        <w:rPr>
+          <w:rFonts w:ascii="Arial" w:hAnsi="Arial" w:cs="Arial"/>
+          <w:lang w:val="es-ES" w:eastAsia="es-EC"/>
+        </w:rPr>
+      </w:pPr>
+      <w:r>
+        <w:rPr>
+          <w:rFonts w:ascii="Arial" w:hAnsi="Arial" w:cs="Arial"/>
+          <w:b/>
+          <w:bCs/>
+          <w:lang w:val="es-ES" w:eastAsia="es-EC"/>
+        </w:rPr>
+        <w:t>Propósito:</w:t>
+      </w:r>
+      <w:r>
+        <w:rPr>
+          <w:rFonts w:ascii="Arial" w:hAnsi="Arial" w:cs="Arial"/>
+          <w:lang w:val="es-ES" w:eastAsia="es-EC"/>
+        </w:rPr>
+        <w:t xml:space="preserve"> Garantizar que solo exista una única instancia de la clase </w:t>
+      </w:r>
+      <w:proofErr w:type="spellStart"/>
+      <w:r>
+        <w:rPr>
+          <w:rFonts w:ascii="Arial" w:hAnsi="Arial" w:cs="Arial"/>
+          <w:lang w:val="es-ES" w:eastAsia="es-EC"/>
+        </w:rPr>
+        <w:t>TicketManager</w:t>
+      </w:r>
+      <w:proofErr w:type="spellEnd"/>
+      <w:r>
+        <w:rPr>
+          <w:rFonts w:ascii="Arial" w:hAnsi="Arial" w:cs="Arial"/>
+          <w:lang w:val="es-ES" w:eastAsia="es-EC"/>
+        </w:rPr>
+        <w:t xml:space="preserve"> y de la conexión a la base de datos durante toda la ejecución de la aplicación.</w:t>
+      </w:r>
+    </w:p>
+    <w:p>
+      <w:pPr>
+        <w:spacing w:line="360" w:lineRule="auto"/>
+        <w:ind w:firstLine="708"/>
+        <w:jc w:val="both"/>
+        <w:rPr>
+          <w:rFonts w:ascii="Arial" w:hAnsi="Arial" w:cs="Arial"/>
+          <w:lang w:val="es-ES" w:eastAsia="es-EC"/>
+        </w:rPr>
+      </w:pPr>
+      <w:r>
+        <w:rPr>
+          <w:rFonts w:ascii="Arial" w:hAnsi="Arial" w:cs="Arial"/>
+          <w:b/>
+          <w:bCs/>
+          <w:lang w:val="es-ES" w:eastAsia="es-EC"/>
+        </w:rPr>
+        <w:t>Problema que resuelve:</w:t>
+      </w:r>
+      <w:r>
+        <w:rPr>
+          <w:rFonts w:ascii="Arial" w:hAnsi="Arial" w:cs="Arial"/>
+          <w:lang w:val="es-ES" w:eastAsia="es-EC"/>
+        </w:rPr>
+        <w:t xml:space="preserve"> En un entorno de Data Center donde múltiples usuarios y técnicos pueden crear o actualizar </w:t>
+      </w:r>
+      <w:proofErr w:type="gramStart"/>
+      <w:r>
+        <w:rPr>
+          <w:rFonts w:ascii="Arial" w:hAnsi="Arial" w:cs="Arial"/>
+          <w:lang w:val="es-ES" w:eastAsia="es-EC"/>
+        </w:rPr>
+        <w:t>tickets</w:t>
+      </w:r>
+      <w:proofErr w:type="gramEnd"/>
+      <w:r>
+        <w:rPr>
+          <w:rFonts w:ascii="Arial" w:hAnsi="Arial" w:cs="Arial"/>
+          <w:lang w:val="es-ES" w:eastAsia="es-EC"/>
+        </w:rPr>
+        <w:t xml:space="preserve"> simultáneamente, es crítico evitar múltiples conexiones a la base de datos o instancias conflictivas del motor de gestión de </w:t>
+      </w:r>
+      <w:proofErr w:type="gramStart"/>
+      <w:r>
+        <w:rPr>
+          <w:rFonts w:ascii="Arial" w:hAnsi="Arial" w:cs="Arial"/>
+          <w:lang w:val="es-ES" w:eastAsia="es-EC"/>
+        </w:rPr>
+        <w:t>tickets</w:t>
+      </w:r>
+      <w:proofErr w:type="gramEnd"/>
+      <w:r>
+        <w:rPr>
+          <w:rFonts w:ascii="Arial" w:hAnsi="Arial" w:cs="Arial"/>
+          <w:lang w:val="es-ES" w:eastAsia="es-EC"/>
+        </w:rPr>
+        <w:t>. El patrón Singleton asegura el control centralizado de recursos compartidos, previene el consumo innecesario de memoria y mantiene la consistencia de los datos.</w:t>
+      </w:r>
+    </w:p>
+    <w:p>
+      <w:pPr>
+        <w:jc w:val="center"/>
+        <w:rPr>
+          <w:rFonts w:ascii="Arial" w:hAnsi="Arial" w:cs="Arial"/>
+          <w:lang w:val="es-ES" w:eastAsia="es-EC"/>
+        </w:rPr>
+      </w:pPr>
+      <w:r>
+        <w:rPr>
+          <w:rFonts w:ascii="Arial" w:hAnsi="Arial" w:cs="Arial"/>
+          <w:noProof/>
+          <w:lang w:val="es-ES" w:eastAsia="es-EC"/>
+        </w:rPr>
+        <w:drawing>
+          <wp:inline distT="0" distB="0" distL="0" distR="0" wp14:anchorId="7B91919F" wp14:editId="77549C22">
+            <wp:extent cx="4352290" cy="2944858"/>
+            <wp:effectExtent l="0" t="0" r="0" b="8255"/>
+            <wp:docPr id="1353851297" name="Imagen 5"/>
+            <wp:cNvGraphicFramePr>
+              <a:graphicFrameLocks xmlns:a="http://schemas.openxmlformats.org/drawingml/2006/main" noChangeAspect="1"/>
+            </wp:cNvGraphicFramePr>
+            <a:graphic xmlns:a="http://schemas.openxmlformats.org/drawingml/2006/main">
+              <a:graphicData uri="http://schemas.openxmlformats.org/drawingml/2006/picture">
+                <pic:pic xmlns:pic="http://schemas.openxmlformats.org/drawingml/2006/picture">
+                  <pic:nvPicPr>
+                    <pic:cNvPr id="1353851297" name="Imagen 1353851297"/>
+                    <pic:cNvPicPr/>
+                  </pic:nvPicPr>
+                  <pic:blipFill>
+                    <a:blip r:embed="rId19">
+                      <a:extLst>
+                        <a:ext uri="{28A0092B-C50C-407E-A947-70E740481C1C}">
+                          <a14:useLocalDpi xmlns:a14="http://schemas.microsoft.com/office/drawing/2010/main" val="0"/>
+                        </a:ext>
+                      </a:extLst>
+                    </a:blip>
+                    <a:stretch>
+                      <a:fillRect/>
+                    </a:stretch>
+                  </pic:blipFill>
+                  <pic:spPr>
+                    <a:xfrm>
+                      <a:off x="0" y="0"/>
+                      <a:ext cx="4356106" cy="2947440"/>
+                    </a:xfrm>
+                    <a:prstGeom prst="rect">
+                      <a:avLst/>
+                    </a:prstGeom>
+                  </pic:spPr>
+                </pic:pic>
+              </a:graphicData>
+            </a:graphic>
+          </wp:inline>
+        </w:drawing>
+      </w:r>
+    </w:p>
+    <w:p>
+      <w:pPr>
+        <w:pStyle w:val="Prrafodelista"/>
+        <w:numPr>
+          <w:ilvl w:val="0"/>
+          <w:numId w:val="22"/>
+        </w:numPr>
+        <w:spacing w:line="360" w:lineRule="auto"/>
+        <w:jc w:val="both"/>
+        <w:rPr>
+          <w:rFonts w:ascii="Arial" w:hAnsi="Arial" w:cs="Arial"/>
+          <w:b/>
+          <w:bCs/>
+          <w:lang w:val="es-ES" w:eastAsia="es-EC"/>
+        </w:rPr>
+      </w:pPr>
+      <w:proofErr w:type="spellStart"/>
+      <w:r>
+        <w:rPr>
+          <w:rFonts w:ascii="Arial" w:hAnsi="Arial" w:cs="Arial"/>
+          <w:b/>
+          <w:bCs/>
+          <w:lang w:val="es-ES" w:eastAsia="es-EC"/>
+        </w:rPr>
+        <w:lastRenderedPageBreak/>
+        <w:t>Observer</w:t>
+      </w:r>
+      <w:proofErr w:type="spellEnd"/>
+      <w:r>
+        <w:rPr>
+          <w:rFonts w:ascii="Arial" w:hAnsi="Arial" w:cs="Arial"/>
+          <w:b/>
+          <w:bCs/>
+          <w:lang w:val="es-ES" w:eastAsia="es-EC"/>
+        </w:rPr>
+        <w:t xml:space="preserve"> (Publicador-Suscriptor)</w:t>
+      </w:r>
+    </w:p>
+    <w:p>
+      <w:pPr>
+        <w:spacing w:line="360" w:lineRule="auto"/>
+        <w:ind w:firstLine="708"/>
+        <w:jc w:val="both"/>
+        <w:rPr>
+          <w:rFonts w:ascii="Arial" w:hAnsi="Arial" w:cs="Arial"/>
+          <w:lang w:val="es-ES" w:eastAsia="es-EC"/>
+        </w:rPr>
+      </w:pPr>
+      <w:r>
+        <w:rPr>
+          <w:rFonts w:ascii="Arial" w:hAnsi="Arial" w:cs="Arial"/>
+          <w:b/>
+          <w:bCs/>
+          <w:lang w:val="es-ES" w:eastAsia="es-EC"/>
+        </w:rPr>
+        <w:t>Propósito:</w:t>
+      </w:r>
+      <w:r>
+        <w:rPr>
+          <w:rFonts w:ascii="Arial" w:hAnsi="Arial" w:cs="Arial"/>
+          <w:lang w:val="es-ES" w:eastAsia="es-EC"/>
+        </w:rPr>
+        <w:t xml:space="preserve"> Notificar automáticamente a los técnicos y usuarios cuando ocurre un evento relevante (creación de </w:t>
+      </w:r>
+      <w:proofErr w:type="gramStart"/>
+      <w:r>
+        <w:rPr>
+          <w:rFonts w:ascii="Arial" w:hAnsi="Arial" w:cs="Arial"/>
+          <w:lang w:val="es-ES" w:eastAsia="es-EC"/>
+        </w:rPr>
+        <w:t>ticket</w:t>
+      </w:r>
+      <w:proofErr w:type="gramEnd"/>
+      <w:r>
+        <w:rPr>
+          <w:rFonts w:ascii="Arial" w:hAnsi="Arial" w:cs="Arial"/>
+          <w:lang w:val="es-ES" w:eastAsia="es-EC"/>
+        </w:rPr>
+        <w:t>, cambio de estado o asignación).</w:t>
+      </w:r>
+    </w:p>
+    <w:p>
+      <w:pPr>
+        <w:spacing w:line="360" w:lineRule="auto"/>
+        <w:ind w:firstLine="708"/>
+        <w:jc w:val="both"/>
+        <w:rPr>
+          <w:rFonts w:ascii="Arial" w:hAnsi="Arial" w:cs="Arial"/>
+          <w:lang w:val="es-ES" w:eastAsia="es-EC"/>
+        </w:rPr>
+      </w:pPr>
+      <w:r>
+        <w:rPr>
+          <w:rFonts w:ascii="Arial" w:hAnsi="Arial" w:cs="Arial"/>
+          <w:b/>
+          <w:bCs/>
+          <w:lang w:val="es-ES" w:eastAsia="es-EC"/>
+        </w:rPr>
+        <w:t>Problema que resuelve:</w:t>
+      </w:r>
+      <w:r>
+        <w:rPr>
+          <w:rFonts w:ascii="Arial" w:hAnsi="Arial" w:cs="Arial"/>
+          <w:lang w:val="es-ES" w:eastAsia="es-EC"/>
+        </w:rPr>
+        <w:t xml:space="preserve"> El sistema requiere que los técnicos sean informados en tiempo real de nuevos incidentes asignados a su especialidad sin necesidad de consultar constantemente el sistema. El patrón </w:t>
+      </w:r>
+      <w:proofErr w:type="spellStart"/>
+      <w:r>
+        <w:rPr>
+          <w:rFonts w:ascii="Arial" w:hAnsi="Arial" w:cs="Arial"/>
+          <w:lang w:val="es-ES" w:eastAsia="es-EC"/>
+        </w:rPr>
+        <w:t>Observer</w:t>
+      </w:r>
+      <w:proofErr w:type="spellEnd"/>
+      <w:r>
+        <w:rPr>
+          <w:rFonts w:ascii="Arial" w:hAnsi="Arial" w:cs="Arial"/>
+          <w:lang w:val="es-ES" w:eastAsia="es-EC"/>
+        </w:rPr>
+        <w:t xml:space="preserve"> desacopla el objeto sujeto (</w:t>
+      </w:r>
+      <w:proofErr w:type="gramStart"/>
+      <w:r>
+        <w:rPr>
+          <w:rFonts w:ascii="Arial" w:hAnsi="Arial" w:cs="Arial"/>
+          <w:lang w:val="es-ES" w:eastAsia="es-EC"/>
+        </w:rPr>
+        <w:t>Ticket</w:t>
+      </w:r>
+      <w:proofErr w:type="gramEnd"/>
+      <w:r>
+        <w:rPr>
+          <w:rFonts w:ascii="Arial" w:hAnsi="Arial" w:cs="Arial"/>
+          <w:lang w:val="es-ES" w:eastAsia="es-EC"/>
+        </w:rPr>
+        <w:t xml:space="preserve">) de los observadores (técnicos, administrador y sistema de correo), permitiendo una arquitectura reactiva y extensible (fácil agregar nuevos canales de notificación como Microsoft </w:t>
+      </w:r>
+      <w:proofErr w:type="spellStart"/>
+      <w:r>
+        <w:rPr>
+          <w:rFonts w:ascii="Arial" w:hAnsi="Arial" w:cs="Arial"/>
+          <w:lang w:val="es-ES" w:eastAsia="es-EC"/>
+        </w:rPr>
+        <w:t>Teams</w:t>
+      </w:r>
+      <w:proofErr w:type="spellEnd"/>
+      <w:r>
+        <w:rPr>
+          <w:rFonts w:ascii="Arial" w:hAnsi="Arial" w:cs="Arial"/>
+          <w:lang w:val="es-ES" w:eastAsia="es-EC"/>
+        </w:rPr>
+        <w:t xml:space="preserve"> o SMS).</w:t>
+      </w:r>
+    </w:p>
+    <w:p>
+      <w:pPr>
+        <w:spacing w:after="0"/>
+        <w:jc w:val="center"/>
+        <w:rPr>
+          <w:rFonts w:ascii="Arial" w:hAnsi="Arial" w:cs="Arial"/>
+          <w:lang w:val="es-ES" w:eastAsia="es-EC"/>
+        </w:rPr>
+      </w:pPr>
+      <w:r>
+        <w:rPr>
+          <w:rFonts w:ascii="Arial" w:hAnsi="Arial" w:cs="Arial"/>
+          <w:noProof/>
+          <w:lang w:val="es-ES" w:eastAsia="es-EC"/>
+        </w:rPr>
+        <w:drawing>
+          <wp:inline distT="0" distB="0" distL="0" distR="0" wp14:anchorId="5E86A23D" wp14:editId="1C0A3C3C">
+            <wp:extent cx="4750768" cy="1333500"/>
+            <wp:effectExtent l="0" t="0" r="0" b="0"/>
+            <wp:docPr id="15411344" name="Imagen 6"/>
+            <wp:cNvGraphicFramePr>
+              <a:graphicFrameLocks xmlns:a="http://schemas.openxmlformats.org/drawingml/2006/main" noChangeAspect="1"/>
+            </wp:cNvGraphicFramePr>
+            <a:graphic xmlns:a="http://schemas.openxmlformats.org/drawingml/2006/main">
+              <a:graphicData uri="http://schemas.openxmlformats.org/drawingml/2006/picture">
+                <pic:pic xmlns:pic="http://schemas.openxmlformats.org/drawingml/2006/picture">
+                  <pic:nvPicPr>
+                    <pic:cNvPr id="15411344" name="Imagen 15411344"/>
+                    <pic:cNvPicPr/>
+                  </pic:nvPicPr>
+                  <pic:blipFill>
+                    <a:blip r:embed="rId20">
+                      <a:extLst>
+                        <a:ext uri="{28A0092B-C50C-407E-A947-70E740481C1C}">
+                          <a14:useLocalDpi xmlns:a14="http://schemas.microsoft.com/office/drawing/2010/main" val="0"/>
+                        </a:ext>
+                      </a:extLst>
+                    </a:blip>
+                    <a:stretch>
+                      <a:fillRect/>
+                    </a:stretch>
+                  </pic:blipFill>
+                  <pic:spPr>
+                    <a:xfrm>
+                      <a:off x="0" y="0"/>
+                      <a:ext cx="4758203" cy="1335587"/>
+                    </a:xfrm>
+                    <a:prstGeom prst="rect">
+                      <a:avLst/>
+                    </a:prstGeom>
+                  </pic:spPr>
+                </pic:pic>
+              </a:graphicData>
+            </a:graphic>
+          </wp:inline>
+        </w:drawing>
+      </w:r>
+    </w:p>
+    <w:p>
+      <w:pPr>
+        <w:pStyle w:val="Prrafodelista"/>
+        <w:numPr>
+          <w:ilvl w:val="0"/>
+          <w:numId w:val="22"/>
+        </w:numPr>
+        <w:spacing w:line="360" w:lineRule="auto"/>
+        <w:jc w:val="both"/>
+        <w:rPr>
+          <w:rFonts w:ascii="Arial" w:hAnsi="Arial" w:cs="Arial"/>
+          <w:b/>
+          <w:bCs/>
+          <w:lang w:val="es-ES" w:eastAsia="es-EC"/>
+        </w:rPr>
+      </w:pPr>
+      <w:r>
+        <w:rPr>
+          <w:rFonts w:ascii="Arial" w:hAnsi="Arial" w:cs="Arial"/>
+          <w:b/>
+          <w:bCs/>
+          <w:lang w:val="es-ES" w:eastAsia="es-EC"/>
+        </w:rPr>
+        <w:t>Factory Method</w:t>
+      </w:r>
+    </w:p>
+    <w:p>
+      <w:pPr>
+        <w:spacing w:line="360" w:lineRule="auto"/>
+        <w:ind w:firstLine="708"/>
+        <w:jc w:val="both"/>
+        <w:rPr>
+          <w:rFonts w:ascii="Arial" w:hAnsi="Arial" w:cs="Arial"/>
+          <w:lang w:val="es-ES" w:eastAsia="es-EC"/>
+        </w:rPr>
+      </w:pPr>
+      <w:r>
+        <w:rPr>
+          <w:rFonts w:ascii="Arial" w:hAnsi="Arial" w:cs="Arial"/>
+          <w:b/>
+          <w:bCs/>
+          <w:lang w:val="es-ES" w:eastAsia="es-EC"/>
+        </w:rPr>
+        <w:t>Propósito:</w:t>
+      </w:r>
+      <w:r>
+        <w:rPr>
+          <w:rFonts w:ascii="Arial" w:hAnsi="Arial" w:cs="Arial"/>
+          <w:lang w:val="es-ES" w:eastAsia="es-EC"/>
+        </w:rPr>
+        <w:t xml:space="preserve"> Crear diferentes tipos de incidentes según su categoría (</w:t>
+      </w:r>
+      <w:proofErr w:type="spellStart"/>
+      <w:r>
+        <w:rPr>
+          <w:rFonts w:ascii="Arial" w:hAnsi="Arial" w:cs="Arial"/>
+          <w:lang w:val="es-ES" w:eastAsia="es-EC"/>
+        </w:rPr>
+        <w:t>HardwareIncident</w:t>
+      </w:r>
+      <w:proofErr w:type="spellEnd"/>
+      <w:r>
+        <w:rPr>
+          <w:rFonts w:ascii="Arial" w:hAnsi="Arial" w:cs="Arial"/>
+          <w:lang w:val="es-ES" w:eastAsia="es-EC"/>
+        </w:rPr>
+        <w:t xml:space="preserve">, </w:t>
+      </w:r>
+      <w:proofErr w:type="spellStart"/>
+      <w:r>
+        <w:rPr>
+          <w:rFonts w:ascii="Arial" w:hAnsi="Arial" w:cs="Arial"/>
+          <w:lang w:val="es-ES" w:eastAsia="es-EC"/>
+        </w:rPr>
+        <w:t>NetworkIncident</w:t>
+      </w:r>
+      <w:proofErr w:type="spellEnd"/>
+      <w:r>
+        <w:rPr>
+          <w:rFonts w:ascii="Arial" w:hAnsi="Arial" w:cs="Arial"/>
+          <w:lang w:val="es-ES" w:eastAsia="es-EC"/>
+        </w:rPr>
+        <w:t xml:space="preserve">, </w:t>
+      </w:r>
+      <w:proofErr w:type="spellStart"/>
+      <w:r>
+        <w:rPr>
+          <w:rFonts w:ascii="Arial" w:hAnsi="Arial" w:cs="Arial"/>
+          <w:lang w:val="es-ES" w:eastAsia="es-EC"/>
+        </w:rPr>
+        <w:t>SoftwareIncident</w:t>
+      </w:r>
+      <w:proofErr w:type="spellEnd"/>
+      <w:r>
+        <w:rPr>
+          <w:rFonts w:ascii="Arial" w:hAnsi="Arial" w:cs="Arial"/>
+          <w:lang w:val="es-ES" w:eastAsia="es-EC"/>
+        </w:rPr>
+        <w:t>) sin especificar la clase concreta en el código cliente.</w:t>
+      </w:r>
+    </w:p>
+    <w:p>
+      <w:pPr>
+        <w:spacing w:line="360" w:lineRule="auto"/>
+        <w:ind w:firstLine="708"/>
+        <w:jc w:val="both"/>
+        <w:rPr>
+          <w:rFonts w:ascii="Arial" w:hAnsi="Arial" w:cs="Arial"/>
+          <w:lang w:val="es-ES" w:eastAsia="es-EC"/>
+        </w:rPr>
+      </w:pPr>
+      <w:r>
+        <w:rPr>
+          <w:rFonts w:ascii="Arial" w:hAnsi="Arial" w:cs="Arial"/>
+          <w:b/>
+          <w:bCs/>
+          <w:lang w:val="es-ES" w:eastAsia="es-EC"/>
+        </w:rPr>
+        <w:t>Problema que resuelve:</w:t>
+      </w:r>
+      <w:r>
+        <w:rPr>
+          <w:rFonts w:ascii="Arial" w:hAnsi="Arial" w:cs="Arial"/>
+          <w:lang w:val="es-ES" w:eastAsia="es-EC"/>
+        </w:rPr>
+        <w:t xml:space="preserve"> Cada tipo de fallo posee atributos, validaciones y flujos de resolución distintos. El Factory Method centraliza la lógica de creación, mejora la mantenibilidad y cumple con el principio Open/</w:t>
+      </w:r>
+      <w:proofErr w:type="spellStart"/>
+      <w:r>
+        <w:rPr>
+          <w:rFonts w:ascii="Arial" w:hAnsi="Arial" w:cs="Arial"/>
+          <w:lang w:val="es-ES" w:eastAsia="es-EC"/>
+        </w:rPr>
+        <w:t>Closed</w:t>
+      </w:r>
+      <w:proofErr w:type="spellEnd"/>
+      <w:r>
+        <w:rPr>
+          <w:rFonts w:ascii="Arial" w:hAnsi="Arial" w:cs="Arial"/>
+          <w:lang w:val="es-ES" w:eastAsia="es-EC"/>
+        </w:rPr>
+        <w:t>, permitiendo agregar nuevas categorías de incidentes (ej. Seguridad o Aplicaciones) sin modificar el código existente.</w:t>
+      </w:r>
+    </w:p>
+    <w:p>
+      <w:pPr>
+        <w:spacing w:line="360" w:lineRule="auto"/>
+        <w:jc w:val="center"/>
+        <w:rPr>
+          <w:rFonts w:ascii="Arial" w:hAnsi="Arial" w:cs="Arial"/>
+          <w:lang w:val="es-ES" w:eastAsia="es-EC"/>
+        </w:rPr>
+      </w:pPr>
+      <w:r>
+        <w:rPr>
+          <w:rFonts w:ascii="Arial" w:hAnsi="Arial" w:cs="Arial"/>
+          <w:noProof/>
+          <w:lang w:val="es-ES" w:eastAsia="es-EC"/>
+        </w:rPr>
+        <w:drawing>
+          <wp:inline distT="0" distB="0" distL="0" distR="0" wp14:anchorId="0A29270A" wp14:editId="17D16D30">
+            <wp:extent cx="4590415" cy="2609368"/>
+            <wp:effectExtent l="0" t="0" r="635" b="635"/>
+            <wp:docPr id="1493844758" name="Imagen 7"/>
+            <wp:cNvGraphicFramePr>
+              <a:graphicFrameLocks xmlns:a="http://schemas.openxmlformats.org/drawingml/2006/main" noChangeAspect="1"/>
+            </wp:cNvGraphicFramePr>
+            <a:graphic xmlns:a="http://schemas.openxmlformats.org/drawingml/2006/main">
+              <a:graphicData uri="http://schemas.openxmlformats.org/drawingml/2006/picture">
+                <pic:pic xmlns:pic="http://schemas.openxmlformats.org/drawingml/2006/picture">
+                  <pic:nvPicPr>
+                    <pic:cNvPr id="1493844758" name="Imagen 1493844758"/>
+                    <pic:cNvPicPr/>
+                  </pic:nvPicPr>
+                  <pic:blipFill>
+                    <a:blip r:embed="rId21">
+                      <a:extLst>
+                        <a:ext uri="{28A0092B-C50C-407E-A947-70E740481C1C}">
+                          <a14:useLocalDpi xmlns:a14="http://schemas.microsoft.com/office/drawing/2010/main" val="0"/>
+                        </a:ext>
+                      </a:extLst>
+                    </a:blip>
+                    <a:stretch>
+                      <a:fillRect/>
+                    </a:stretch>
+                  </pic:blipFill>
+                  <pic:spPr>
+                    <a:xfrm>
+                      <a:off x="0" y="0"/>
+                      <a:ext cx="4595661" cy="2612350"/>
+                    </a:xfrm>
+                    <a:prstGeom prst="rect">
+                      <a:avLst/>
+                    </a:prstGeom>
+                  </pic:spPr>
+                </pic:pic>
+              </a:graphicData>
+            </a:graphic>
+          </wp:inline>
+        </w:drawing>
+      </w:r>
+    </w:p>
+    <w:p>
+      <w:pPr>
+        <w:pStyle w:val="Prrafodelista"/>
+        <w:numPr>
+          <w:ilvl w:val="0"/>
+          <w:numId w:val="22"/>
+        </w:numPr>
+        <w:spacing w:line="360" w:lineRule="auto"/>
+        <w:jc w:val="both"/>
+        <w:rPr>
+          <w:rFonts w:ascii="Arial" w:hAnsi="Arial" w:cs="Arial"/>
+          <w:b/>
+          <w:bCs/>
+          <w:lang w:val="es-ES" w:eastAsia="es-EC"/>
+        </w:rPr>
+      </w:pPr>
+      <w:r>
+        <w:rPr>
+          <w:rFonts w:ascii="Arial" w:hAnsi="Arial" w:cs="Arial"/>
+          <w:b/>
+          <w:bCs/>
+          <w:lang w:val="es-ES" w:eastAsia="es-EC"/>
+        </w:rPr>
+        <w:lastRenderedPageBreak/>
+        <w:t>MVC (Model-View-</w:t>
+      </w:r>
+      <w:proofErr w:type="spellStart"/>
+      <w:r>
+        <w:rPr>
+          <w:rFonts w:ascii="Arial" w:hAnsi="Arial" w:cs="Arial"/>
+          <w:b/>
+          <w:bCs/>
+          <w:lang w:val="es-ES" w:eastAsia="es-EC"/>
+        </w:rPr>
+        <w:t>Controller</w:t>
+      </w:r>
+      <w:proofErr w:type="spellEnd"/>
+      <w:r>
+        <w:rPr>
+          <w:rFonts w:ascii="Arial" w:hAnsi="Arial" w:cs="Arial"/>
+          <w:b/>
+          <w:bCs/>
+          <w:lang w:val="es-ES" w:eastAsia="es-EC"/>
+        </w:rPr>
+        <w:t>)</w:t>
+      </w:r>
+    </w:p>
+    <w:p>
+      <w:pPr>
+        <w:spacing w:line="360" w:lineRule="auto"/>
+        <w:ind w:firstLine="708"/>
+        <w:jc w:val="both"/>
+        <w:rPr>
+          <w:rFonts w:ascii="Arial" w:hAnsi="Arial" w:cs="Arial"/>
+          <w:lang w:val="es-ES" w:eastAsia="es-EC"/>
+        </w:rPr>
+      </w:pPr>
+      <w:r>
+        <w:rPr>
+          <w:rFonts w:ascii="Arial" w:hAnsi="Arial" w:cs="Arial"/>
+          <w:b/>
+          <w:bCs/>
+          <w:lang w:val="es-ES" w:eastAsia="es-EC"/>
+        </w:rPr>
+        <w:t>Propósito:</w:t>
+      </w:r>
+      <w:r>
+        <w:rPr>
+          <w:rFonts w:ascii="Arial" w:hAnsi="Arial" w:cs="Arial"/>
+          <w:lang w:val="es-ES" w:eastAsia="es-EC"/>
+        </w:rPr>
+        <w:t xml:space="preserve"> Separar la lógica de negocio, la presentación y el control de flujos en capas independientes.</w:t>
+      </w:r>
+    </w:p>
+    <w:p>
+      <w:pPr>
+        <w:spacing w:line="360" w:lineRule="auto"/>
+        <w:ind w:firstLine="708"/>
+        <w:jc w:val="both"/>
+        <w:rPr>
+          <w:rFonts w:ascii="Arial" w:hAnsi="Arial" w:cs="Arial"/>
+          <w:lang w:val="es-ES" w:eastAsia="es-EC"/>
+        </w:rPr>
+      </w:pPr>
+      <w:r>
+        <w:rPr>
+          <w:rFonts w:ascii="Arial" w:hAnsi="Arial" w:cs="Arial"/>
+          <w:b/>
+          <w:bCs/>
+          <w:lang w:val="es-ES" w:eastAsia="es-EC"/>
+        </w:rPr>
+        <w:t>Problema que resuelve:</w:t>
+      </w:r>
+      <w:r>
+        <w:rPr>
+          <w:rFonts w:ascii="Arial" w:hAnsi="Arial" w:cs="Arial"/>
+          <w:lang w:val="es-ES" w:eastAsia="es-EC"/>
+        </w:rPr>
+        <w:t xml:space="preserve"> Proporciona una estructura clara y organizada del sistema, facilitando el trabajo en equipo, las pruebas unitarias y futuras modificaciones en la interfaz de usuario sin afectar la lógica de negocio. Es especialmente útil en aplicaciones web donde se requiere una clara separación de responsabilidades.</w:t>
+      </w:r>
+    </w:p>
+    <w:p>
+      <w:pPr>
+        <w:rPr>
+          <w:rFonts w:ascii="Arial" w:hAnsi="Arial" w:cs="Arial"/>
+          <w:b/>
+          <w:bCs/>
+          <w:lang w:eastAsia="es-EC"/>
+        </w:rPr>
+      </w:pPr>
+      <w:r>
+        <w:rPr>
+          <w:rFonts w:ascii="Arial" w:hAnsi="Arial" w:cs="Arial"/>
+          <w:b/>
+          <w:bCs/>
+          <w:noProof/>
+          <w:lang w:eastAsia="es-EC"/>
+        </w:rPr>
+        <w:drawing>
+          <wp:inline distT="0" distB="0" distL="0" distR="0" wp14:anchorId="28CEB20E" wp14:editId="23109929">
+            <wp:extent cx="5400040" cy="3676650"/>
+            <wp:effectExtent l="0" t="0" r="0" b="0"/>
+            <wp:docPr id="492072536" name="Imagen 8"/>
+            <wp:cNvGraphicFramePr>
+              <a:graphicFrameLocks xmlns:a="http://schemas.openxmlformats.org/drawingml/2006/main" noChangeAspect="1"/>
+            </wp:cNvGraphicFramePr>
+            <a:graphic xmlns:a="http://schemas.openxmlformats.org/drawingml/2006/main">
+              <a:graphicData uri="http://schemas.openxmlformats.org/drawingml/2006/picture">
+                <pic:pic xmlns:pic="http://schemas.openxmlformats.org/drawingml/2006/picture">
+                  <pic:nvPicPr>
+                    <pic:cNvPr id="492072536" name="Imagen 492072536"/>
+                    <pic:cNvPicPr/>
+                  </pic:nvPicPr>
+                  <pic:blipFill>
+                    <a:blip r:embed="rId22">
+                      <a:extLst>
+                        <a:ext uri="{28A0092B-C50C-407E-A947-70E740481C1C}">
+                          <a14:useLocalDpi xmlns:a14="http://schemas.microsoft.com/office/drawing/2010/main" val="0"/>
+                        </a:ext>
+                      </a:extLst>
+                    </a:blip>
+                    <a:stretch>
+                      <a:fillRect/>
+                    </a:stretch>
+                  </pic:blipFill>
+                  <pic:spPr>
+                    <a:xfrm>
+                      <a:off x="0" y="0"/>
+                      <a:ext cx="5400040" cy="3676650"/>
+                    </a:xfrm>
+                    <a:prstGeom prst="rect">
+                      <a:avLst/>
+                    </a:prstGeom>
+                  </pic:spPr>
+                </pic:pic>
+              </a:graphicData>
+            </a:graphic>
+          </wp:inline>
+        </w:drawing>
+      </w:r>
+    </w:p>
+    <w:p>
+      <w:pPr>
+        <w:rPr>
+          <w:rFonts w:ascii="Arial" w:hAnsi="Arial" w:cs="Arial"/>
+          <w:b/>
+          <w:bCs/>
+          <w:lang w:eastAsia="es-EC"/>
+        </w:rPr>
+      </w:pPr>
+      <w:r>
+        <w:rPr>
+          <w:rFonts w:ascii="Arial" w:hAnsi="Arial" w:cs="Arial"/>
+          <w:b/>
+          <w:bCs/>
+          <w:lang w:eastAsia="es-EC"/>
+        </w:rPr>
+        <w:t xml:space="preserve">Justificación del Uso de </w:t>
+      </w:r>
+      <w:proofErr w:type="spellStart"/>
+      <w:r>
+        <w:rPr>
+          <w:rFonts w:ascii="Arial" w:hAnsi="Arial" w:cs="Arial"/>
+          <w:b/>
+          <w:bCs/>
+          <w:lang w:eastAsia="es-EC"/>
+        </w:rPr>
+        <w:t>Gitflow</w:t>
+      </w:r>
+      <w:proofErr w:type="spellEnd"/>
+    </w:p>
+    <w:p>
+      <w:pPr>
+        <w:spacing w:line="360" w:lineRule="auto"/>
+        <w:ind w:firstLine="708"/>
+        <w:jc w:val="both"/>
+        <w:rPr>
+          <w:rFonts w:ascii="Arial" w:hAnsi="Arial" w:cs="Arial"/>
+          <w:lang w:eastAsia="es-EC"/>
+        </w:rPr>
+      </w:pPr>
+      <w:r>
+        <w:rPr>
+          <w:rFonts w:ascii="Arial" w:hAnsi="Arial" w:cs="Arial"/>
+          <w:lang w:eastAsia="es-EC"/>
+        </w:rPr>
+        <w:t xml:space="preserve">El desarrollo del sistema se ha gestionado mediante el modelo </w:t>
+      </w:r>
+      <w:proofErr w:type="spellStart"/>
+      <w:r>
+        <w:rPr>
+          <w:rFonts w:ascii="Arial" w:hAnsi="Arial" w:cs="Arial"/>
+          <w:lang w:eastAsia="es-EC"/>
+        </w:rPr>
+        <w:t>Gitflow</w:t>
+      </w:r>
+      <w:proofErr w:type="spellEnd"/>
+      <w:r>
+        <w:rPr>
+          <w:rFonts w:ascii="Arial" w:hAnsi="Arial" w:cs="Arial"/>
+          <w:lang w:eastAsia="es-EC"/>
+        </w:rPr>
+        <w:t xml:space="preserve"> en un repositorio de GitHub. Este flujo de trabajo fue seleccionado porque permite un control ordenado de las versiones, separación clara entre desarrollo, pruebas y producción, y facilita el trabajo colaborativo.</w:t>
+      </w:r>
+    </w:p>
+    <w:p>
+      <w:pPr>
+        <w:spacing w:line="360" w:lineRule="auto"/>
+        <w:jc w:val="both"/>
+        <w:rPr>
+          <w:rFonts w:ascii="Arial" w:hAnsi="Arial" w:cs="Arial"/>
+          <w:lang w:eastAsia="es-EC"/>
+        </w:rPr>
+      </w:pPr>
+    </w:p>
+    <w:p>
+      <w:pPr>
+        <w:spacing w:line="360" w:lineRule="auto"/>
+        <w:jc w:val="both"/>
+        <w:rPr>
+          <w:rFonts w:ascii="Arial" w:hAnsi="Arial" w:cs="Arial"/>
+          <w:lang w:eastAsia="es-EC"/>
+        </w:rPr>
+      </w:pPr>
+    </w:p>
+    <w:p>
+      <w:pPr>
+        <w:spacing w:line="360" w:lineRule="auto"/>
+        <w:jc w:val="both"/>
+        <w:rPr>
+          <w:rFonts w:ascii="Arial" w:hAnsi="Arial" w:cs="Arial"/>
+          <w:lang w:eastAsia="es-EC"/>
+        </w:rPr>
+      </w:pPr>
+    </w:p>
+    <w:p>
+      <w:pPr>
+        <w:spacing w:line="360" w:lineRule="auto"/>
+        <w:jc w:val="both"/>
+        <w:rPr>
+          <w:rFonts w:ascii="Arial" w:hAnsi="Arial" w:cs="Arial"/>
+          <w:lang w:eastAsia="es-EC"/>
+        </w:rPr>
+      </w:pPr>
+    </w:p>
+    <w:p>
+      <w:pPr>
+        <w:spacing w:line="360" w:lineRule="auto"/>
+        <w:jc w:val="both"/>
+        <w:rPr>
+          <w:rFonts w:ascii="Arial" w:hAnsi="Arial" w:cs="Arial"/>
+          <w:lang w:eastAsia="es-EC"/>
+        </w:rPr>
+      </w:pPr>
+    </w:p>
+    <w:p>
+      <w:pPr>
+        <w:pStyle w:val="Sinespaciado"/>
+        <w:jc w:val="both"/>
+        <w:rPr>
+          <w:rFonts w:ascii="Arial" w:hAnsi="Arial" w:cs="Arial"/>
+          <w:b/>
+          <w:bCs/>
+          <w:lang w:eastAsia="es-EC"/>
+        </w:rPr>
+      </w:pPr>
+      <w:r>
+        <w:rPr>
+          <w:rFonts w:ascii="Arial" w:hAnsi="Arial" w:cs="Arial"/>
+          <w:b/>
+          <w:bCs/>
+          <w:lang w:eastAsia="es-EC"/>
+        </w:rPr>
+        <w:lastRenderedPageBreak/>
+        <w:t>Evidencias</w:t>
+      </w:r>
+    </w:p>
+    <w:p>
+      <w:pPr>
+        <w:widowControl w:val="0"/>
+        <w:pBdr>
+          <w:top w:val="nil"/>
+          <w:left w:val="nil"/>
+          <w:bottom w:val="nil"/>
+          <w:right w:val="nil"/>
+          <w:between w:val="nil"/>
+        </w:pBdr>
+        <w:spacing w:after="0" w:line="240" w:lineRule="auto"/>
+        <w:jc w:val="center"/>
+        <w:rPr>
+          <w:rFonts w:ascii="Arial" w:hAnsi="Arial" w:cs="Arial"/>
+          <w:b/>
+          <w:bCs/>
+          <w:sz w:val="24"/>
+          <w:szCs w:val="24"/>
+          <w:lang w:eastAsia="es-EC"/>
+        </w:rPr>
+      </w:pPr>
+      <w:r>
+        <w:rPr>
+          <w:rFonts w:ascii="Arial" w:hAnsi="Arial" w:cs="Arial"/>
+          <w:b/>
+          <w:bCs/>
+          <w:sz w:val="24"/>
+          <w:szCs w:val="24"/>
+          <w:lang w:eastAsia="es-EC"/>
+        </w:rPr>
+        <w:drawing>
+          <wp:inline distT="0" distB="0" distL="0" distR="0" wp14:anchorId="47B87A18" wp14:editId="097BE6E0">
+            <wp:extent cx="5027878" cy="2590800"/>
+            <wp:effectExtent l="0" t="0" r="1905" b="0"/>
+            <wp:docPr id="231628117" name="Imagen 1"/>
+            <wp:cNvGraphicFramePr>
+              <a:graphicFrameLocks xmlns:a="http://schemas.openxmlformats.org/drawingml/2006/main" noChangeAspect="1"/>
+            </wp:cNvGraphicFramePr>
+            <a:graphic xmlns:a="http://schemas.openxmlformats.org/drawingml/2006/main">
+              <a:graphicData uri="http://schemas.openxmlformats.org/drawingml/2006/picture">
+                <pic:pic xmlns:pic="http://schemas.openxmlformats.org/drawingml/2006/picture">
+                  <pic:nvPicPr>
+                    <pic:cNvPr id="231628117" name=""/>
+                    <pic:cNvPicPr/>
+                  </pic:nvPicPr>
+                  <pic:blipFill>
+                    <a:blip r:embed="rId23"/>
+                    <a:stretch>
+                      <a:fillRect/>
+                    </a:stretch>
+                  </pic:blipFill>
+                  <pic:spPr>
+                    <a:xfrm>
+                      <a:off x="0" y="0"/>
+                      <a:ext cx="5032073" cy="2592962"/>
+                    </a:xfrm>
+                    <a:prstGeom prst="rect">
+                      <a:avLst/>
+                    </a:prstGeom>
+                  </pic:spPr>
+                </pic:pic>
+              </a:graphicData>
+            </a:graphic>
+          </wp:inline>
+        </w:drawing>
+      </w:r>
+    </w:p>
+    <w:p>
+      <w:pPr>
+        <w:widowControl w:val="0"/>
+        <w:pBdr>
+          <w:top w:val="nil"/>
+          <w:left w:val="nil"/>
+          <w:bottom w:val="nil"/>
+          <w:right w:val="nil"/>
+          <w:between w:val="nil"/>
+        </w:pBdr>
+        <w:spacing w:before="240" w:after="0" w:line="240" w:lineRule="auto"/>
+        <w:jc w:val="center"/>
+        <w:rPr>
+          <w:rFonts w:ascii="Arial" w:hAnsi="Arial" w:cs="Arial"/>
+          <w:i/>
+          <w:iCs/>
+          <w:sz w:val="20"/>
+          <w:szCs w:val="20"/>
+          <w:lang w:eastAsia="es-EC"/>
+        </w:rPr>
+      </w:pPr>
+      <w:r>
+        <w:rPr>
+          <w:rFonts w:ascii="Arial" w:hAnsi="Arial" w:cs="Arial"/>
+          <w:i/>
+          <w:iCs/>
+          <w:sz w:val="20"/>
+          <w:szCs w:val="20"/>
+          <w:lang w:eastAsia="es-EC"/>
+        </w:rPr>
+        <w:t>Agregando usuario Global y clonando el repositorio</w:t>
+      </w:r>
+    </w:p>
+    <w:p>
+      <w:pPr>
+        <w:widowControl w:val="0"/>
+        <w:pBdr>
+          <w:top w:val="nil"/>
+          <w:left w:val="nil"/>
+          <w:bottom w:val="nil"/>
+          <w:right w:val="nil"/>
+          <w:between w:val="nil"/>
+        </w:pBdr>
+        <w:spacing w:after="0" w:line="240" w:lineRule="auto"/>
+        <w:jc w:val="center"/>
+        <w:rPr>
+          <w:rFonts w:ascii="Arial" w:hAnsi="Arial" w:cs="Arial"/>
+          <w:b/>
+          <w:bCs/>
+          <w:sz w:val="24"/>
+          <w:szCs w:val="24"/>
+          <w:lang w:eastAsia="es-EC"/>
+        </w:rPr>
+      </w:pPr>
+      <w:r>
+        <w:rPr>
+          <w:rFonts w:ascii="Arial" w:hAnsi="Arial" w:cs="Arial"/>
+          <w:b/>
+          <w:bCs/>
+          <w:sz w:val="24"/>
+          <w:szCs w:val="24"/>
+          <w:lang w:eastAsia="es-EC"/>
+        </w:rPr>
+        <w:drawing>
+          <wp:inline distT="0" distB="0" distL="0" distR="0" wp14:anchorId="61AFA452" wp14:editId="2A3FCC03">
+            <wp:extent cx="4924425" cy="2541545"/>
+            <wp:effectExtent l="0" t="0" r="0" b="0"/>
+            <wp:docPr id="437611912" name="Imagen 1"/>
+            <wp:cNvGraphicFramePr>
+              <a:graphicFrameLocks xmlns:a="http://schemas.openxmlformats.org/drawingml/2006/main" noChangeAspect="1"/>
+            </wp:cNvGraphicFramePr>
+            <a:graphic xmlns:a="http://schemas.openxmlformats.org/drawingml/2006/main">
+              <a:graphicData uri="http://schemas.openxmlformats.org/drawingml/2006/picture">
+                <pic:pic xmlns:pic="http://schemas.openxmlformats.org/drawingml/2006/picture">
+                  <pic:nvPicPr>
+                    <pic:cNvPr id="437611912" name=""/>
+                    <pic:cNvPicPr/>
+                  </pic:nvPicPr>
+                  <pic:blipFill>
+                    <a:blip r:embed="rId24"/>
+                    <a:stretch>
+                      <a:fillRect/>
+                    </a:stretch>
+                  </pic:blipFill>
+                  <pic:spPr>
+                    <a:xfrm>
+                      <a:off x="0" y="0"/>
+                      <a:ext cx="4926758" cy="2542749"/>
+                    </a:xfrm>
+                    <a:prstGeom prst="rect">
+                      <a:avLst/>
+                    </a:prstGeom>
+                  </pic:spPr>
+                </pic:pic>
+              </a:graphicData>
+            </a:graphic>
+          </wp:inline>
+        </w:drawing>
+      </w:r>
+    </w:p>
+    <w:p>
+      <w:pPr>
+        <w:widowControl w:val="0"/>
+        <w:pBdr>
+          <w:top w:val="nil"/>
+          <w:left w:val="nil"/>
+          <w:bottom w:val="nil"/>
+          <w:right w:val="nil"/>
+          <w:between w:val="nil"/>
+        </w:pBdr>
+        <w:spacing w:before="240" w:after="0" w:line="240" w:lineRule="auto"/>
+        <w:jc w:val="center"/>
+        <w:rPr>
+          <w:rFonts w:ascii="Arial" w:hAnsi="Arial" w:cs="Arial"/>
+          <w:i/>
+          <w:iCs/>
+          <w:sz w:val="20"/>
+          <w:szCs w:val="20"/>
+          <w:lang w:eastAsia="es-EC"/>
+        </w:rPr>
+      </w:pPr>
+      <w:r>
+        <w:rPr>
+          <w:rFonts w:ascii="Arial" w:hAnsi="Arial" w:cs="Arial"/>
+          <w:i/>
+          <w:iCs/>
+          <w:sz w:val="20"/>
+          <w:szCs w:val="20"/>
+          <w:lang w:eastAsia="es-EC"/>
+        </w:rPr>
+        <w:t xml:space="preserve">Creación de la rama </w:t>
+      </w:r>
+      <w:proofErr w:type="spellStart"/>
+      <w:r>
+        <w:rPr>
+          <w:rFonts w:ascii="Arial" w:hAnsi="Arial" w:cs="Arial"/>
+          <w:i/>
+          <w:iCs/>
+          <w:sz w:val="20"/>
+          <w:szCs w:val="20"/>
+          <w:lang w:eastAsia="es-EC"/>
+        </w:rPr>
+        <w:t>Develop</w:t>
+      </w:r>
+      <w:proofErr w:type="spellEnd"/>
+      <w:r>
+        <w:rPr>
+          <w:rFonts w:ascii="Arial" w:hAnsi="Arial" w:cs="Arial"/>
+          <w:i/>
+          <w:iCs/>
+          <w:sz w:val="20"/>
+          <w:szCs w:val="20"/>
+          <w:lang w:eastAsia="es-EC"/>
+        </w:rPr>
+        <w:t xml:space="preserve"> </w:t>
+      </w:r>
+    </w:p>
+    <w:p>
+      <w:pPr>
+        <w:widowControl w:val="0"/>
+        <w:pBdr>
+          <w:top w:val="nil"/>
+          <w:left w:val="nil"/>
+          <w:bottom w:val="nil"/>
+          <w:right w:val="nil"/>
+          <w:between w:val="nil"/>
+        </w:pBdr>
+        <w:spacing w:after="0" w:line="240" w:lineRule="auto"/>
+        <w:jc w:val="center"/>
+        <w:rPr>
+          <w:rFonts w:ascii="Arial" w:hAnsi="Arial" w:cs="Arial"/>
+          <w:i/>
+          <w:iCs/>
+          <w:sz w:val="24"/>
+          <w:szCs w:val="24"/>
+          <w:lang w:eastAsia="es-EC"/>
+        </w:rPr>
+      </w:pPr>
+      <w:r>
+        <w:rPr>
+          <w:rFonts w:ascii="Arial" w:eastAsiaTheme="majorEastAsia" w:hAnsi="Arial" w:cs="Arial"/>
+          <w:b/>
+          <w:bCs/>
+          <w:color w:val="2F5496" w:themeColor="accent1" w:themeShade="BF"/>
+          <w:sz w:val="24"/>
+          <w:szCs w:val="24"/>
+          <w:lang w:eastAsia="es-EC"/>
+        </w:rPr>
+        <w:drawing>
+          <wp:inline distT="0" distB="0" distL="0" distR="0" wp14:anchorId="28EB3CCB" wp14:editId="6388084B">
+            <wp:extent cx="4714240" cy="2078279"/>
+            <wp:effectExtent l="0" t="0" r="0" b="0"/>
+            <wp:docPr id="1055090405" name="Imagen 1"/>
+            <wp:cNvGraphicFramePr>
+              <a:graphicFrameLocks xmlns:a="http://schemas.openxmlformats.org/drawingml/2006/main" noChangeAspect="1"/>
+            </wp:cNvGraphicFramePr>
+            <a:graphic xmlns:a="http://schemas.openxmlformats.org/drawingml/2006/main">
+              <a:graphicData uri="http://schemas.openxmlformats.org/drawingml/2006/picture">
+                <pic:pic xmlns:pic="http://schemas.openxmlformats.org/drawingml/2006/picture">
+                  <pic:nvPicPr>
+                    <pic:cNvPr id="1055090405" name=""/>
+                    <pic:cNvPicPr/>
+                  </pic:nvPicPr>
+                  <pic:blipFill>
+                    <a:blip r:embed="rId25"/>
+                    <a:stretch>
+                      <a:fillRect/>
+                    </a:stretch>
+                  </pic:blipFill>
+                  <pic:spPr>
+                    <a:xfrm>
+                      <a:off x="0" y="0"/>
+                      <a:ext cx="4717426" cy="2079683"/>
+                    </a:xfrm>
+                    <a:prstGeom prst="rect">
+                      <a:avLst/>
+                    </a:prstGeom>
+                  </pic:spPr>
+                </pic:pic>
+              </a:graphicData>
+            </a:graphic>
+          </wp:inline>
+        </w:drawing>
       </w:r>
     </w:p>
     <w:p>
@@ -4629,25 +6505,147 @@
     </w:p>
     <w:p>
       <w:pPr>
-        <w:pStyle w:val="Sinespaciado"/>
-        <w:spacing w:line="360" w:lineRule="auto"/>
-        <w:jc w:val="both"/>
-        <w:rPr>
-          <w:rFonts w:ascii="Arial" w:hAnsi="Arial" w:cs="Arial"/>
-          <w:b/>
-          <w:bCs/>
-          <w:lang w:eastAsia="es-EC"/>
-        </w:rPr>
-      </w:pPr>
-      <w:r>
-        <w:rPr>
-          <w:rFonts w:ascii="Arial" w:hAnsi="Arial" w:cs="Arial"/>
-          <w:b/>
-          <w:bCs/>
-          <w:lang w:eastAsia="es-EC"/>
-        </w:rPr>
-        <w:t>Bibliografía</w:t>
-      </w:r>
+        <w:widowControl w:val="0"/>
+        <w:pBdr>
+          <w:top w:val="nil"/>
+          <w:left w:val="nil"/>
+          <w:bottom w:val="nil"/>
+          <w:right w:val="nil"/>
+          <w:between w:val="nil"/>
+        </w:pBdr>
+        <w:spacing w:after="0" w:line="240" w:lineRule="auto"/>
+        <w:jc w:val="center"/>
+        <w:rPr>
+          <w:rFonts w:ascii="Arial" w:eastAsiaTheme="majorEastAsia" w:hAnsi="Arial" w:cs="Arial"/>
+          <w:i/>
+          <w:iCs/>
+          <w:sz w:val="20"/>
+          <w:szCs w:val="20"/>
+          <w:lang w:eastAsia="es-EC"/>
+        </w:rPr>
+      </w:pPr>
+      <w:r>
+        <w:rPr>
+          <w:rFonts w:ascii="Arial" w:eastAsiaTheme="majorEastAsia" w:hAnsi="Arial" w:cs="Arial"/>
+          <w:i/>
+          <w:iCs/>
+          <w:sz w:val="20"/>
+          <w:szCs w:val="20"/>
+          <w:lang w:eastAsia="es-EC"/>
+        </w:rPr>
+        <w:t xml:space="preserve">Creación de la rama </w:t>
+      </w:r>
+      <w:proofErr w:type="spellStart"/>
+      <w:r>
+        <w:rPr>
+          <w:rFonts w:ascii="Arial" w:eastAsiaTheme="majorEastAsia" w:hAnsi="Arial" w:cs="Arial"/>
+          <w:i/>
+          <w:iCs/>
+          <w:sz w:val="20"/>
+          <w:szCs w:val="20"/>
+          <w:lang w:eastAsia="es-EC"/>
+        </w:rPr>
+        <w:t>feacture</w:t>
+      </w:r>
+      <w:proofErr w:type="spellEnd"/>
+    </w:p>
+    <w:p>
+      <w:pPr>
+        <w:widowControl w:val="0"/>
+        <w:pBdr>
+          <w:top w:val="nil"/>
+          <w:left w:val="nil"/>
+          <w:bottom w:val="nil"/>
+          <w:right w:val="nil"/>
+          <w:between w:val="nil"/>
+        </w:pBdr>
+        <w:spacing w:after="0" w:line="240" w:lineRule="auto"/>
+        <w:jc w:val="center"/>
+        <w:rPr>
+          <w:rFonts w:ascii="Arial" w:hAnsi="Arial" w:cs="Arial"/>
+          <w:i/>
+          <w:iCs/>
+          <w:sz w:val="24"/>
+          <w:szCs w:val="24"/>
+          <w:lang w:eastAsia="es-EC"/>
+        </w:rPr>
+      </w:pPr>
+      <w:r>
+        <w:rPr>
+          <w:rFonts w:ascii="Arial" w:hAnsi="Arial" w:cs="Arial"/>
+          <w:i/>
+          <w:iCs/>
+          <w:sz w:val="24"/>
+          <w:szCs w:val="24"/>
+          <w:lang w:eastAsia="es-EC"/>
+        </w:rPr>
+        <w:br w:type="page"/>
+      </w:r>
+    </w:p>
+    <w:p>
+      <w:pPr>
+        <w:widowControl w:val="0"/>
+        <w:pBdr>
+          <w:top w:val="nil"/>
+          <w:left w:val="nil"/>
+          <w:bottom w:val="nil"/>
+          <w:right w:val="nil"/>
+          <w:between w:val="nil"/>
+        </w:pBdr>
+        <w:spacing w:after="0" w:line="240" w:lineRule="auto"/>
+        <w:rPr>
+          <w:rFonts w:ascii="Arial" w:hAnsi="Arial" w:cs="Arial"/>
+          <w:i/>
+          <w:iCs/>
+          <w:sz w:val="20"/>
+          <w:szCs w:val="20"/>
+          <w:lang w:eastAsia="es-EC"/>
+        </w:rPr>
+      </w:pPr>
+    </w:p>
+    <w:p>
+      <w:pPr>
+        <w:widowControl w:val="0"/>
+        <w:pBdr>
+          <w:top w:val="nil"/>
+          <w:left w:val="nil"/>
+          <w:bottom w:val="nil"/>
+          <w:right w:val="nil"/>
+          <w:between w:val="nil"/>
+        </w:pBdr>
+        <w:spacing w:after="0" w:line="240" w:lineRule="auto"/>
+        <w:jc w:val="center"/>
+        <w:rPr>
+          <w:rFonts w:ascii="Arial" w:eastAsiaTheme="majorEastAsia" w:hAnsi="Arial" w:cs="Arial"/>
+          <w:i/>
+          <w:iCs/>
+          <w:sz w:val="20"/>
+          <w:szCs w:val="20"/>
+          <w:lang w:eastAsia="es-EC"/>
+        </w:rPr>
+      </w:pPr>
+    </w:p>
+    <w:p>
+      <w:pPr>
+        <w:widowControl w:val="0"/>
+        <w:pBdr>
+          <w:top w:val="nil"/>
+          <w:left w:val="nil"/>
+          <w:bottom w:val="nil"/>
+          <w:right w:val="nil"/>
+          <w:between w:val="nil"/>
+        </w:pBdr>
+        <w:spacing w:after="0" w:line="240" w:lineRule="auto"/>
+        <w:jc w:val="center"/>
+        <w:rPr>
+          <w:rFonts w:ascii="Arial" w:eastAsiaTheme="majorEastAsia" w:hAnsi="Arial" w:cs="Arial"/>
+          <w:i/>
+          <w:iCs/>
+          <w:sz w:val="20"/>
+          <w:szCs w:val="20"/>
+          <w:lang w:eastAsia="es-EC"/>
+        </w:rPr>
+      </w:pPr>
     </w:p>
     <w:p>
       <w:pPr>
@@ -4662,6 +6660,73 @@
         <w:spacing w:after="0" w:line="240" w:lineRule="auto"/>
         <w:jc w:val="both"/>
         <w:rPr>
+          <w:rFonts w:ascii="Arial" w:eastAsia="Arial" w:hAnsi="Arial" w:cs="Arial"/>
+          <w:i/>
+          <w:iCs/>
+          <w:color w:val="000000"/>
+          <w:sz w:val="20"/>
+          <w:szCs w:val="20"/>
+        </w:rPr>
+      </w:pPr>
+    </w:p>
+    <w:p>
+      <w:pPr>
+        <w:widowControl w:val="0"/>
+        <w:pBdr>
+          <w:top w:val="nil"/>
+          <w:left w:val="nil"/>
+          <w:bottom w:val="nil"/>
+          <w:right w:val="nil"/>
+          <w:between w:val="nil"/>
+        </w:pBdr>
+        <w:spacing w:after="0" w:line="240" w:lineRule="auto"/>
+        <w:jc w:val="both"/>
+        <w:rPr>
+          <w:rFonts w:ascii="Arial" w:eastAsiaTheme="majorEastAsia" w:hAnsi="Arial" w:cs="Arial"/>
+          <w:b/>
+          <w:bCs/>
+          <w:color w:val="2F5496" w:themeColor="accent1" w:themeShade="BF"/>
+          <w:sz w:val="24"/>
+          <w:szCs w:val="24"/>
+          <w:lang w:eastAsia="es-EC"/>
+        </w:rPr>
+      </w:pPr>
+    </w:p>
+    <w:p>
+      <w:pPr>
+        <w:pStyle w:val="Sinespaciado"/>
+        <w:spacing w:line="360" w:lineRule="auto"/>
+        <w:jc w:val="both"/>
+        <w:rPr>
+          <w:rFonts w:ascii="Arial" w:hAnsi="Arial" w:cs="Arial"/>
+          <w:b/>
+          <w:bCs/>
+          <w:lang w:eastAsia="es-EC"/>
+        </w:rPr>
+      </w:pPr>
+      <w:r>
+        <w:rPr>
+          <w:rFonts w:ascii="Arial" w:hAnsi="Arial" w:cs="Arial"/>
+          <w:b/>
+          <w:bCs/>
+          <w:lang w:eastAsia="es-EC"/>
+        </w:rPr>
+        <w:t>Bibliografía</w:t>
+      </w:r>
+    </w:p>
+    <w:p>
+      <w:pPr>
+        <w:widowControl w:val="0"/>
+        <w:pBdr>
+          <w:top w:val="nil"/>
+          <w:left w:val="nil"/>
+          <w:bottom w:val="nil"/>
+          <w:right w:val="nil"/>
+          <w:between w:val="nil"/>
+        </w:pBdr>
+        <w:spacing w:after="0" w:line="240" w:lineRule="auto"/>
+        <w:jc w:val="both"/>
+        <w:rPr>
           <w:rFonts w:ascii="Arial" w:hAnsi="Arial" w:cs="Arial"/>
           <w:i/>
           <w:iCs/>
@@ -4729,7 +6794,7 @@
         </w:rPr>
         <w:t xml:space="preserve">: una solución para la gestión de incidencias. Gaceta Científica, 10(2), 76-81. </w:t>
       </w:r>
-      <w:hyperlink r:id="rId14" w:history="1">
+      <w:hyperlink r:id="rId26" w:history="1">
         <w:r>
           <w:rPr>
             <w:rStyle w:val="Hipervnculo"/>
@@ -4756,7 +6821,7 @@
       </w:r>
     </w:p>
     <w:sectPr>
-      <w:headerReference w:type="first" r:id="rId15"/>
+      <w:headerReference w:type="first" r:id="rId27"/>
       <w:pgSz w:w="11906" w:h="16838"/>
       <w:pgMar w:top="1417" w:right="1701" w:bottom="1417" w:left="1701" w:header="708" w:footer="708" w:gutter="0"/>
       <w:pgNumType w:start="1"/>
@@ -7420,6 +9485,95 @@
     </w:lvl>
   </w:abstractNum>
   <w:abstractNum w:abstractNumId="15" w15:restartNumberingAfterBreak="0">
+    <w:nsid w:val="6BF30D69"/>
+    <w:multiLevelType w:val="hybridMultilevel"/>
+    <w:tmpl w:val="8402B7CE"/>
+    <w:lvl w:ilvl="0" w:tplc="0C0A000F">
+      <w:start w:val="1"/>
+      <w:numFmt w:val="decimal"/>
+      <w:lvlText w:val="%1."/>
+      <w:lvlJc w:val="left"/>
+      <w:pPr>
+        <w:ind w:left="720" w:hanging="360"/>
+      </w:pPr>
+      <w:rPr>
+        <w:rFonts w:hint="default"/>
+      </w:rPr>
+    </w:lvl>
+    <w:lvl w:ilvl="1" w:tplc="0C0A0019" w:tentative="1">
+      <w:start w:val="1"/>
+      <w:numFmt w:val="lowerLetter"/>
+      <w:lvlText w:val="%2."/>
+      <w:lvlJc w:val="left"/>
+      <w:pPr>
+        <w:ind w:left="1440" w:hanging="360"/>
+      </w:pPr>
+    </w:lvl>
+    <w:lvl w:ilvl="2" w:tplc="0C0A001B" w:tentative="1">
+      <w:start w:val="1"/>
+      <w:numFmt w:val="lowerRoman"/>
+      <w:lvlText w:val="%3."/>
+      <w:lvlJc w:val="right"/>
+      <w:pPr>
+        <w:ind w:left="2160" w:hanging="180"/>
+      </w:pPr>
+    </w:lvl>
+    <w:lvl w:ilvl="3" w:tplc="0C0A000F" w:tentative="1">
+      <w:start w:val="1"/>
+      <w:numFmt w:val="decimal"/>
+      <w:lvlText w:val="%4."/>
+      <w:lvlJc w:val="left"/>
+      <w:pPr>
+        <w:ind w:left="2880" w:hanging="360"/>
+      </w:pPr>
+    </w:lvl>
+    <w:lvl w:ilvl="4" w:tplc="0C0A0019" w:tentative="1">
+      <w:start w:val="1"/>
+      <w:numFmt w:val="lowerLetter"/>
+      <w:lvlText w:val="%5."/>
+      <w:lvlJc w:val="left"/>
+      <w:pPr>
+        <w:ind w:left="3600" w:hanging="360"/>
+      </w:pPr>
+    </w:lvl>
+    <w:lvl w:ilvl="5" w:tplc="0C0A001B" w:tentative="1">
+      <w:start w:val="1"/>
+      <w:numFmt w:val="lowerRoman"/>
+      <w:lvlText w:val="%6."/>
+      <w:lvlJc w:val="right"/>
+      <w:pPr>
+        <w:ind w:left="4320" w:hanging="180"/>
+      </w:pPr>
+    </w:lvl>
+    <w:lvl w:ilvl="6" w:tplc="0C0A000F" w:tentative="1">
+      <w:start w:val="1"/>
+      <w:numFmt w:val="decimal"/>
+      <w:lvlText w:val="%7."/>
+      <w:lvlJc w:val="left"/>
+      <w:pPr>
+        <w:ind w:left="5040" w:hanging="360"/>
+      </w:pPr>
+    </w:lvl>
+    <w:lvl w:ilvl="7" w:tplc="0C0A0019" w:tentative="1">
+      <w:start w:val="1"/>
+      <w:numFmt w:val="lowerLetter"/>
+      <w:lvlText w:val="%8."/>
+      <w:lvlJc w:val="left"/>
+      <w:pPr>
+        <w:ind w:left="5760" w:hanging="360"/>
+      </w:pPr>
+    </w:lvl>
+    <w:lvl w:ilvl="8" w:tplc="0C0A001B" w:tentative="1">
+      <w:start w:val="1"/>
+      <w:numFmt w:val="lowerRoman"/>
+      <w:lvlText w:val="%9."/>
+      <w:lvlJc w:val="right"/>
+      <w:pPr>
+        <w:ind w:left="6480" w:hanging="180"/>
+      </w:pPr>
+    </w:lvl>
+  </w:abstractNum>
+  <w:abstractNum w:abstractNumId="16" w15:restartNumberingAfterBreak="0">
     <w:nsid w:val="6FA144D3"/>
     <w:multiLevelType w:val="multilevel"/>
     <w:tmpl w:val="98CEB7D6"/>
@@ -7540,7 +9694,7 @@
       </w:rPr>
     </w:lvl>
   </w:abstractNum>
-  <w:abstractNum w:abstractNumId="16" w15:restartNumberingAfterBreak="0">
+  <w:abstractNum w:abstractNumId="17" w15:restartNumberingAfterBreak="0">
     <w:nsid w:val="738344F2"/>
     <w:multiLevelType w:val="hybridMultilevel"/>
     <w:tmpl w:val="C4E037F2"/>
@@ -7655,7 +9809,7 @@
       </w:rPr>
     </w:lvl>
   </w:abstractNum>
-  <w:abstractNum w:abstractNumId="17" w15:restartNumberingAfterBreak="0">
+  <w:abstractNum w:abstractNumId="18" w15:restartNumberingAfterBreak="0">
     <w:nsid w:val="74B1685F"/>
     <w:multiLevelType w:val="hybridMultilevel"/>
     <w:tmpl w:val="943E89B2"/>
@@ -7768,7 +9922,7 @@
       </w:rPr>
     </w:lvl>
   </w:abstractNum>
-  <w:abstractNum w:abstractNumId="18" w15:restartNumberingAfterBreak="0">
+  <w:abstractNum w:abstractNumId="19" w15:restartNumberingAfterBreak="0">
     <w:nsid w:val="75DB1EAD"/>
     <w:multiLevelType w:val="multilevel"/>
     <w:tmpl w:val="F2B0D608"/>
@@ -7881,7 +10035,7 @@
       </w:rPr>
     </w:lvl>
   </w:abstractNum>
-  <w:abstractNum w:abstractNumId="19" w15:restartNumberingAfterBreak="0">
+  <w:abstractNum w:abstractNumId="20" w15:restartNumberingAfterBreak="0">
     <w:nsid w:val="77694BC3"/>
     <w:multiLevelType w:val="hybridMultilevel"/>
     <w:tmpl w:val="8D0A3582"/>
@@ -7994,7 +10148,7 @@
       </w:rPr>
     </w:lvl>
   </w:abstractNum>
-  <w:abstractNum w:abstractNumId="20" w15:restartNumberingAfterBreak="0">
+  <w:abstractNum w:abstractNumId="21" w15:restartNumberingAfterBreak="0">
     <w:nsid w:val="7CE94054"/>
     <w:multiLevelType w:val="multilevel"/>
     <w:tmpl w:val="A4D4C1F2"/>
@@ -8112,16 +10266,16 @@
     <w:abstractNumId w:val="6"/>
   </w:num>
   <w:num w:numId="2" w16cid:durableId="65693884">
-    <w:abstractNumId w:val="16"/>
+    <w:abstractNumId w:val="17"/>
   </w:num>
   <w:num w:numId="3" w16cid:durableId="2100101922">
-    <w:abstractNumId w:val="15"/>
+    <w:abstractNumId w:val="16"/>
   </w:num>
   <w:num w:numId="4" w16cid:durableId="396048364">
     <w:abstractNumId w:val="13"/>
   </w:num>
   <w:num w:numId="5" w16cid:durableId="1108769845">
-    <w:abstractNumId w:val="20"/>
+    <w:abstractNumId w:val="21"/>
   </w:num>
   <w:num w:numId="6" w16cid:durableId="1604147248">
     <w:abstractNumId w:val="10"/>
@@ -8130,10 +10284,10 @@
     <w:abstractNumId w:val="14"/>
   </w:num>
   <w:num w:numId="8" w16cid:durableId="2123069530">
-    <w:abstractNumId w:val="18"/>
+    <w:abstractNumId w:val="19"/>
   </w:num>
   <w:num w:numId="9" w16cid:durableId="1229996977">
-    <w:abstractNumId w:val="19"/>
+    <w:abstractNumId w:val="20"/>
   </w:num>
   <w:num w:numId="10" w16cid:durableId="519272247">
     <w:abstractNumId w:val="1"/>
@@ -8154,7 +10308,7 @@
     <w:abstractNumId w:val="0"/>
   </w:num>
   <w:num w:numId="16" w16cid:durableId="193423106">
-    <w:abstractNumId w:val="17"/>
+    <w:abstractNumId w:val="18"/>
   </w:num>
   <w:num w:numId="17" w16cid:durableId="100270423">
     <w:abstractNumId w:val="12"/>
@@ -8170,6 +10324,9 @@
   </w:num>
   <w:num w:numId="21" w16cid:durableId="672728619">
     <w:abstractNumId w:val="7"/>
+  </w:num>
+  <w:num w:numId="22" w16cid:durableId="57558525">
+    <w:abstractNumId w:val="15"/>
   </w:num>
 </w:numbering>
 </file>

</xml_diff>